<commit_message>
Merge Steven's replacement Technology paragraph (AI/data-processing disclosure)
Replace original Technology opener with Steven's broader paragraph; retain the
unique vendor-agreement-signing authorization sentence. Update walkthrough.

Co-Authored-By: Claude Opus 4.8 <noreply@anthropic.com>
Claude-Session: https://claude.ai/code/session_01DN4EejCmNTZeYY4X9coMuA
</commit_message>
<xml_diff>
--- a/Onyx_Engagement_Letter_REVISED.docx
+++ b/Onyx_Engagement_Letter_REVISED.docx
@@ -5820,76 +5820,16 @@
         <w:jc w:val="both"/>
       </w:pPr>
       <w:r>
-        <w:t>ONYX</w:t>
-      </w:r>
-      <w:r>
-        <w:t xml:space="preserve"> may, at times, use third-party software applications to perform services under this agreement. </w:t>
-      </w:r>
-      <w:r>
-        <w:t xml:space="preserve">The Client </w:t>
-      </w:r>
-      <w:r>
-        <w:t>authorize</w:t>
-      </w:r>
-      <w:r>
-        <w:t>s</w:t>
-      </w:r>
-      <w:r>
-        <w:t xml:space="preserve"> </w:t>
-      </w:r>
-      <w:r>
-        <w:t>ONYX</w:t>
-      </w:r>
-      <w:r>
-        <w:t xml:space="preserve"> to sign on </w:t>
-      </w:r>
-      <w:r>
-        <w:t xml:space="preserve">the Client’s </w:t>
-      </w:r>
-      <w:r>
-        <w:t xml:space="preserve">behalf any vendor agreements applicable to such software applications. </w:t>
-      </w:r>
-      <w:r>
-        <w:t>ONYX</w:t>
-      </w:r>
-      <w:r>
-        <w:t xml:space="preserve"> </w:t>
-      </w:r>
-      <w:r>
-        <w:t xml:space="preserve">shall </w:t>
-      </w:r>
-      <w:r>
-        <w:t xml:space="preserve">provide a copy of the application agreement at </w:t>
-      </w:r>
-      <w:r>
-        <w:t xml:space="preserve">the Client’s </w:t>
-      </w:r>
-      <w:r>
-        <w:t xml:space="preserve">request. </w:t>
-      </w:r>
-      <w:r>
-        <w:t xml:space="preserve">The Client </w:t>
-      </w:r>
-      <w:r>
-        <w:t>acknowledge</w:t>
-      </w:r>
-      <w:r>
-        <w:t>s and agrees that</w:t>
-      </w:r>
-      <w:r>
-        <w:t xml:space="preserve"> the software vendor may have access to </w:t>
-      </w:r>
-      <w:r>
-        <w:t>the Client</w:t>
-      </w:r>
-      <w:r>
-        <w:t>’</w:t>
-      </w:r>
-      <w:r>
-        <w:t xml:space="preserve">s </w:t>
-      </w:r>
-      <w:r>
-        <w:t>data.</w:t>
+        <w:t xml:space="preserve">ONYX may use third-party software, cloud-based platforms, and advanced technologies, including automated data processing and artificial intelligence tools, to assist in delivering services under this agreement. You acknowledge and authorize ONYX to share and process your data with such providers as necessary to perform the services. These providers may have access to your data solely for the purpose of supporting ONYX’s service delivery. ONYX uses commercially reasonable efforts to select and maintain service providers with appropriate data security and confidentiality standards.</w:t>
+      </w:r>
+    </w:p>
+    <w:p>
+      <w:pPr>
+        <w:pStyle w:val="CLALTRNormal"/>
+        <w:jc w:val="both"/>
+      </w:pPr>
+      <w:r>
+        <w:t xml:space="preserve">The Client authorizes ONYX to sign on the Client’s behalf any vendor agreements applicable to such software applications, and ONYX shall provide a copy of the application agreement at the Client’s request.</w:t>
       </w:r>
     </w:p>
     <w:p>

</xml_diff>

<commit_message>
Polish pass: corrections, remove CLA template scaffolding, reconcile scope
Tier 1: fix 'our its', 'CLient', 'refutable'->'rebuttable', 'legal services'->'services'.
Tier 2: strip all embedded CLA template instructions and 8 guidance endnotes; reword
  unenforceable client-insurance sentence; reconcile Scope vs. Objectives wording.
Tier 3: normalize 'agreement' casing; 'you/your'->'the Client' in Technology; relocate
  Client indemnification next to Limitation of remedies.

Co-Authored-By: Claude Opus 4.8 <noreply@anthropic.com>
Claude-Session: https://claude.ai/code/session_01DN4EejCmNTZeYY4X9coMuA
</commit_message>
<xml_diff>
--- a/Onyx_Engagement_Letter_REVISED.docx
+++ b/Onyx_Engagement_Letter_REVISED.docx
@@ -385,244 +385,6 @@
     <w:p>
       <w:pPr>
         <w:pStyle w:val="CLALTRNormal"/>
-        <w:rPr>
-          <w:rStyle w:val="CLALTRHiddenTextChar"/>
-        </w:rPr>
-      </w:pPr>
-      <w:r>
-        <w:rPr>
-          <w:rStyle w:val="CLALTRHiddenTextChar"/>
-        </w:rPr>
-        <w:lastRenderedPageBreak/>
-        <w:t>BizOps - preparation assistance engagement letter (no tax services)</w:t>
-      </w:r>
-      <w:r>
-        <w:rPr>
-          <w:rStyle w:val="CLALTRHiddenTextChar"/>
-        </w:rPr>
-        <w:tab/>
-      </w:r>
-      <w:r>
-        <w:rPr>
-          <w:rStyle w:val="CLALTRHiddenTextChar"/>
-        </w:rPr>
-        <w:tab/>
-      </w:r>
-      <w:r>
-        <w:rPr>
-          <w:rStyle w:val="CLALTRHiddenTextChar"/>
-        </w:rPr>
-        <w:tab/>
-      </w:r>
-      <w:r>
-        <w:rPr>
-          <w:rStyle w:val="CLALTRHiddenTextChar"/>
-        </w:rPr>
-        <w:t xml:space="preserve">DAR </w:t>
-      </w:r>
-      <w:r>
-        <w:rPr>
-          <w:rStyle w:val="CLALTRHiddenTextChar"/>
-          <w:szCs w:val="22"/>
-        </w:rPr>
-        <w:t>6/2</w:t>
-      </w:r>
-      <w:r>
-        <w:rPr>
-          <w:rStyle w:val="CLALTRHiddenTextChar"/>
-          <w:szCs w:val="22"/>
-        </w:rPr>
-        <w:t>6</w:t>
-      </w:r>
-      <w:r>
-        <w:rPr>
-          <w:rStyle w:val="CLALTRHiddenTextChar"/>
-          <w:szCs w:val="22"/>
-        </w:rPr>
-        <w:t>/17</w:t>
-      </w:r>
-      <w:r>
-        <w:rPr>
-          <w:rStyle w:val="CLALTRHiddenTextChar"/>
-        </w:rPr>
-        <w:t xml:space="preserve">    </w:t>
-      </w:r>
-      <w:r>
-        <w:rPr>
-          <w:rStyle w:val="CLALTRHiddenTextChar"/>
-        </w:rPr>
-        <w:endnoteReference w:id="2"/>
-      </w:r>
-      <w:r>
-        <w:rPr>
-          <w:rStyle w:val="CLALTRHiddenTextChar"/>
-        </w:rPr>
-        <w:t xml:space="preserve">    </w:t>
-      </w:r>
-      <w:r>
-        <w:rPr>
-          <w:rStyle w:val="CLALTRHiddenTextChar"/>
-        </w:rPr>
-        <w:endnoteReference w:id="3"/>
-      </w:r>
-      <w:r>
-        <w:rPr>
-          <w:rStyle w:val="CLALTRHiddenTextChar"/>
-        </w:rPr>
-        <w:t xml:space="preserve"> </w:t>
-      </w:r>
-      <w:r>
-        <w:rPr>
-          <w:rStyle w:val="CLALTRHiddenTextChar"/>
-        </w:rPr>
-        <w:t xml:space="preserve">   </w:t>
-      </w:r>
-      <w:r>
-        <w:rPr>
-          <w:rStyle w:val="CLALTRHiddenTextChar"/>
-        </w:rPr>
-        <w:endnoteReference w:id="4"/>
-      </w:r>
-    </w:p>
-    <w:p>
-      <w:pPr>
-        <w:pStyle w:val="CLALTRNormal"/>
-        <w:rPr>
-          <w:rStyle w:val="CLALTRHiddenTextChar"/>
-        </w:rPr>
-      </w:pPr>
-      <w:r>
-        <w:rPr>
-          <w:rStyle w:val="CLALTRHiddenTextChar"/>
-        </w:rPr>
-        <w:t xml:space="preserve">Modified for </w:t>
-      </w:r>
-      <w:r>
-        <w:rPr>
-          <w:rStyle w:val="CLALTRHiddenTextChar"/>
-        </w:rPr>
-        <w:t>BizOps</w:t>
-      </w:r>
-      <w:r>
-        <w:rPr>
-          <w:rStyle w:val="CLALTRHiddenTextChar"/>
-        </w:rPr>
-        <w:t xml:space="preserve"> to be:</w:t>
-      </w:r>
-    </w:p>
-    <w:p>
-      <w:pPr>
-        <w:pStyle w:val="CLALTRNormal"/>
-        <w:numPr>
-          <w:ilvl w:val="0"/>
-          <w:numId w:val="12"/>
-        </w:numPr>
-        <w:rPr>
-          <w:rStyle w:val="CLALTRHiddenTextChar"/>
-        </w:rPr>
-      </w:pPr>
-      <w:r>
-        <w:rPr>
-          <w:rStyle w:val="CLALTRHiddenTextChar"/>
-        </w:rPr>
-        <w:t xml:space="preserve">INTERIM, </w:t>
-      </w:r>
-      <w:r>
-        <w:rPr>
-          <w:rStyle w:val="CLALTRHiddenTextChar"/>
-        </w:rPr>
-        <w:t>EVERGREEN</w:t>
-      </w:r>
-    </w:p>
-    <w:p>
-      <w:pPr>
-        <w:pStyle w:val="CLALTRNormal"/>
-        <w:numPr>
-          <w:ilvl w:val="0"/>
-          <w:numId w:val="12"/>
-        </w:numPr>
-        <w:rPr>
-          <w:rStyle w:val="CLALTRHiddenTextChar"/>
-        </w:rPr>
-      </w:pPr>
-      <w:r>
-        <w:rPr>
-          <w:rStyle w:val="CLALTRHiddenTextChar"/>
-        </w:rPr>
-        <w:t xml:space="preserve">NOT INDEPENDENT – This letter assumes independence is </w:t>
-      </w:r>
-      <w:r>
-        <w:rPr>
-          <w:rStyle w:val="CLALTRHiddenTextChar"/>
-        </w:rPr>
-        <w:t>NOT</w:t>
-      </w:r>
-      <w:r>
-        <w:rPr>
-          <w:rStyle w:val="CLALTRHiddenTextChar"/>
-        </w:rPr>
-        <w:t xml:space="preserve"> required for these or any other services. (If independence is to be maintained, the </w:t>
-      </w:r>
-      <w:r>
-        <w:rPr>
-          <w:rStyle w:val="CLALTRHiddenTextChar"/>
-        </w:rPr>
-        <w:t>“independent” preparation</w:t>
-      </w:r>
-      <w:r>
-        <w:rPr>
-          <w:rStyle w:val="CLALTRHiddenTextChar"/>
-        </w:rPr>
-        <w:t xml:space="preserve"> </w:t>
-      </w:r>
-      <w:r>
-        <w:rPr>
-          <w:rStyle w:val="CLALTRHiddenTextChar"/>
-        </w:rPr>
-        <w:t xml:space="preserve">assistance </w:t>
-      </w:r>
-      <w:r>
-        <w:rPr>
-          <w:rStyle w:val="CLALTRHiddenTextChar"/>
-        </w:rPr>
-        <w:t>engagement letter should be used</w:t>
-      </w:r>
-      <w:r>
-        <w:rPr>
-          <w:rStyle w:val="CLALTRHiddenTextChar"/>
-        </w:rPr>
-        <w:t>.</w:t>
-      </w:r>
-      <w:r>
-        <w:rPr>
-          <w:rStyle w:val="CLALTRHiddenTextChar"/>
-        </w:rPr>
-        <w:t>)</w:t>
-      </w:r>
-    </w:p>
-    <w:p>
-      <w:pPr>
-        <w:pStyle w:val="CLALTRNormal"/>
-        <w:rPr>
-          <w:rStyle w:val="CLALTRHiddenTextChar"/>
-        </w:rPr>
-      </w:pPr>
-      <w:r>
-        <w:rPr>
-          <w:rStyle w:val="CLALTRHiddenTextChar"/>
-        </w:rPr>
-        <w:t xml:space="preserve">Please read the guidance in endnote 2 for information to help you efficiently use this CLA </w:t>
-      </w:r>
-      <w:r>
-        <w:rPr>
-          <w:rStyle w:val="CLALTRHiddenTextChar"/>
-        </w:rPr>
-        <w:t>template.</w:t>
-      </w:r>
-    </w:p>
-    <w:p>
-      <w:pPr>
-        <w:pStyle w:val="CLALTRNormal"/>
       </w:pPr>
       <w:r>
         <w:fldChar w:fldCharType="begin">
@@ -724,12 +486,6 @@
         </w:rPr>
         <w:t xml:space="preserve">   </w:t>
       </w:r>
-      <w:r>
-        <w:rPr>
-          <w:rStyle w:val="CLALTRHiddenTextChar"/>
-        </w:rPr>
-        <w:endnoteReference w:id="5"/>
-      </w:r>
     </w:p>
     <w:bookmarkStart w:id="2" w:name="Text46"/>
     <w:p>
@@ -2013,76 +1769,11 @@
     </w:p>
     <w:p>
       <w:pPr>
-        <w:pStyle w:val="CLALTRNormalIndent"/>
-        <w:ind w:left="0"/>
-        <w:jc w:val="both"/>
-      </w:pPr>
-      <w:r>
-        <w:t xml:space="preserve">The objective of </w:t>
-      </w:r>
-      <w:r>
-        <w:t xml:space="preserve">ONYX’s </w:t>
-      </w:r>
-      <w:r>
-        <w:t xml:space="preserve">engagement is to assist </w:t>
-      </w:r>
-      <w:r>
-        <w:t xml:space="preserve">the Client </w:t>
-      </w:r>
-      <w:r>
-        <w:t xml:space="preserve">in the preparation of financial statements by providing the services identified above. </w:t>
-      </w:r>
-      <w:r>
-        <w:t>ONYX has</w:t>
-      </w:r>
-      <w:r>
-        <w:t xml:space="preserve"> not been engaged to prepare financial statements</w:t>
-      </w:r>
-      <w:r>
-        <w:t>,</w:t>
-      </w:r>
-      <w:r>
-        <w:t xml:space="preserve"> and financial </w:t>
-      </w:r>
-      <w:r>
-        <w:lastRenderedPageBreak/>
-        <w:t xml:space="preserve">statements will not be presented to </w:t>
-      </w:r>
-      <w:r>
-        <w:t>the Client</w:t>
-      </w:r>
-      <w:r>
-        <w:t xml:space="preserve">. Financial statements that may be generated from </w:t>
-      </w:r>
-      <w:r>
-        <w:t>the Client’s</w:t>
-      </w:r>
-      <w:r>
-        <w:t xml:space="preserve"> </w:t>
-      </w:r>
-      <w:r>
-        <w:t xml:space="preserve">accounting system have not been </w:t>
-      </w:r>
-      <w:r>
-        <w:t xml:space="preserve">prepared, </w:t>
-      </w:r>
-      <w:r>
-        <w:t xml:space="preserve">compiled, reviewed, or audited by </w:t>
-      </w:r>
-      <w:r>
-        <w:t>ONYX</w:t>
-      </w:r>
-      <w:r>
-        <w:t xml:space="preserve"> </w:t>
-      </w:r>
-      <w:r>
-        <w:t xml:space="preserve">and, accordingly, will not include an opinion or any other form of assurance. The financial statements will not be accompanied by a report, and </w:t>
-      </w:r>
-      <w:r>
-        <w:t>ONYX</w:t>
-      </w:r>
-      <w:r>
-        <w:t xml:space="preserve"> should not be discussed or associated with them.</w:t>
+        <w:pStyle w:val="CLALTRNormal"/>
+        <w:jc w:val="both"/>
+      </w:pPr>
+      <w:r>
+        <w:t xml:space="preserve">The objective of ONYX’s engagement is to assist the Client in the preparation of financial statements by providing the services identified above. ONYX has not been engaged to prepare financial statements, and financial statements will not be presented to the Client. Financial statements that may be generated from the Client’s accounting system have not been prepared, compiled, reviewed, or audited by ONYX and, accordingly, will not include an opinion or any other form of assurance. The financial statements will not be accompanied by a report, and ONYX should not be discussed or associated with them. Any analysis or presentation of financial information that ONYX provides to management is based on financial statements generated from the Client’s accounting system and does not constitute the preparation, compilation, review, or audit of financial statements by ONYX.</w:t>
       </w:r>
     </w:p>
     <w:p>
@@ -2692,15 +2383,6 @@
       </w:pPr>
       <w:r>
         <w:t>Fees, time estimates, and terms</w:t>
-      </w:r>
-    </w:p>
-    <w:p>
-      <w:pPr>
-        <w:pStyle w:val="CLALTRHiddenText"/>
-        <w:jc w:val="both"/>
-      </w:pPr>
-      <w:r>
-        <w:t>Include the following section for “hourly” fee engagements</w:t>
       </w:r>
     </w:p>
     <w:p>
@@ -3072,7 +2754,7 @@
           <w:b/>
           <w:i/>
         </w:rPr>
-        <w:t>(Delete if not applicable)</w:t>
+        <w:t/>
       </w:r>
     </w:p>
     <w:p>
@@ -3670,15 +3352,6 @@
     </w:p>
     <w:p>
       <w:pPr>
-        <w:pStyle w:val="CLALTRHiddenText"/>
-        <w:jc w:val="both"/>
-      </w:pPr>
-      <w:r>
-        <w:t>Include the following section for “fixed” fee engagements</w:t>
-      </w:r>
-    </w:p>
-    <w:p>
-      <w:pPr>
         <w:pStyle w:val="CLALTRNormal"/>
         <w:jc w:val="both"/>
       </w:pPr>
@@ -3979,7 +3652,7 @@
         <w:rPr>
           <w:highlight w:val="yellow"/>
         </w:rPr>
-        <w:t xml:space="preserve"> The actual cost of our legal services may be more or less than the fee estimate.</w:t>
+        <w:t xml:space="preserve"> The actual cost of our services may be more or less than the fee estimate.</w:t>
       </w:r>
       <w:r>
         <w:rPr>
@@ -4130,15 +3803,6 @@
           <w:highlight w:val="yellow"/>
         </w:rPr>
         <w:t xml:space="preserve"> will be billed at cost and are not included in the fees quoted above.</w:t>
-      </w:r>
-    </w:p>
-    <w:p>
-      <w:pPr>
-        <w:pStyle w:val="CLALTRHiddenText"/>
-        <w:jc w:val="both"/>
-      </w:pPr>
-      <w:r>
-        <w:t>Include the following fee paragraphs (i.e., invoices, retainer, other fees, and finance charges) in both hourly and fixed fee engagement letters, as appropriate</w:t>
       </w:r>
     </w:p>
     <w:p>
@@ -4268,12 +3932,6 @@
           <w:rStyle w:val="CLALTRHiddenTextChar"/>
         </w:rPr>
         <w:t xml:space="preserve"> </w:t>
-      </w:r>
-      <w:r>
-        <w:rPr>
-          <w:rStyle w:val="CLALTRHiddenTextChar"/>
-        </w:rPr>
-        <w:endnoteReference w:id="6"/>
       </w:r>
       <w:r>
         <w:t xml:space="preserve"> days or more overdue and will not be resumed until </w:t>
@@ -4693,6 +4351,84 @@
         <w:jc w:val="both"/>
       </w:pPr>
       <w:r>
+        <w:t>Finance charges and collection expenses</w:t>
+      </w:r>
+    </w:p>
+    <w:p>
+      <w:pPr>
+        <w:pStyle w:val="CLALTRNormal"/>
+        <w:jc w:val="both"/>
+      </w:pPr>
+      <w:r>
+        <w:t>The Client</w:t>
+      </w:r>
+      <w:r>
+        <w:t xml:space="preserve"> </w:t>
+      </w:r>
+      <w:r>
+        <w:t>agree</w:t>
+      </w:r>
+      <w:r>
+        <w:t>s</w:t>
+      </w:r>
+      <w:r>
+        <w:t xml:space="preserve"> that if any statement is not paid within </w:t>
+      </w:r>
+      <w:r>
+        <w:t>thirty (</w:t>
+      </w:r>
+      <w:r>
+        <w:t>30</w:t>
+      </w:r>
+      <w:r>
+        <w:t>)</w:t>
+      </w:r>
+      <w:r>
+        <w:t xml:space="preserve"> days from its </w:t>
+      </w:r>
+      <w:r>
+        <w:t xml:space="preserve">billing </w:t>
+      </w:r>
+      <w:r>
+        <w:t xml:space="preserve">date, the unpaid balance shall accrue interest at the monthly rate of one and one-quarter percent (1.25%), which is an annual percentage rate of 15%. </w:t>
+      </w:r>
+      <w:proofErr w:type="gramStart"/>
+      <w:r>
+        <w:t>In the event that</w:t>
+      </w:r>
+      <w:proofErr w:type="gramEnd"/>
+      <w:r>
+        <w:t xml:space="preserve"> any collection action is required to collect unpaid balances </w:t>
+      </w:r>
+      <w:proofErr w:type="gramStart"/>
+      <w:r>
+        <w:t>due</w:t>
+      </w:r>
+      <w:proofErr w:type="gramEnd"/>
+      <w:r>
+        <w:t xml:space="preserve"> us, </w:t>
+      </w:r>
+      <w:r>
+        <w:t xml:space="preserve">then the Client agrees that ONYX (or any attorney that ONYX may hire for this purpose) may also recover from the Client the </w:t>
+      </w:r>
+      <w:r>
+        <w:t xml:space="preserve">attorneys’ fees and costs to collect such sums, </w:t>
+      </w:r>
+      <w:proofErr w:type="gramStart"/>
+      <w:r>
+        <w:t>whether or not</w:t>
+      </w:r>
+      <w:proofErr w:type="gramEnd"/>
+      <w:r>
+        <w:t xml:space="preserve"> the Client contests the matter.</w:t>
+      </w:r>
+    </w:p>
+    <w:p>
+      <w:pPr>
+        <w:pStyle w:val="CLALTRHeading2"/>
+        <w:jc w:val="both"/>
+      </w:pPr>
+      <w:r>
         <w:t xml:space="preserve">Client indemnification</w:t>
       </w:r>
     </w:p>
@@ -4707,11 +4443,11 @@
     </w:p>
     <w:p>
       <w:pPr>
-        <w:pStyle w:val="CLALTRHeading2"/>
-        <w:jc w:val="both"/>
-      </w:pPr>
-      <w:r>
-        <w:t>Finance charges and collection expenses</w:t>
+        <w:pStyle w:val="CLALTRHeading1"/>
+        <w:jc w:val="both"/>
+      </w:pPr>
+      <w:r>
+        <w:t>Limitation of remedies</w:t>
       </w:r>
     </w:p>
     <w:p>
@@ -4720,76 +4456,55 @@
         <w:jc w:val="both"/>
       </w:pPr>
       <w:r>
-        <w:t>The Client</w:t>
-      </w:r>
-      <w:r>
+        <w:t xml:space="preserve">ONYX’s role is strictly limited to the engagement described in this letter, and ONYX offers no assurance as to the results or ultimate outcomes of this engagement or of any decisions that the Client may make based on ONYX’s communications with the Client. The Client agrees that it is appropriate to limit the liability of the ONYX Parties.</w:t>
+      </w:r>
+    </w:p>
+    <w:p>
+      <w:pPr>
+        <w:pStyle w:val="CLALTRNormal"/>
+        <w:jc w:val="both"/>
+      </w:pPr>
+      <w:r>
+        <w:t>If a dispute arises from or relates to this agreement or the breach thereof, and if the dispute cannot be settled through direct discussions, the parties agree to endeavor first to settle the dispute by mediation administered by the American Arbitration Association</w:t>
+      </w:r>
+      <w:r>
+        <w:t xml:space="preserve"> in Maricopa County, Arizona</w:t>
+      </w:r>
+      <w:r>
+        <w:t xml:space="preserve"> under its Commercial Mediation Procedures before resorting to arbitration. The parties further agree that any unresolved controversy or claim arising out of or relating to this agreement, or breach thereof, shall be settled by arbitration administered by the American Arbitration Association</w:t>
+      </w:r>
+      <w:r>
+        <w:t xml:space="preserve"> in Maricopa County, Arizona</w:t>
+      </w:r>
+      <w:r>
+        <w:t xml:space="preserve"> in accordance with its Commercial Arbitration Rules and judgment on the award rendered by the arbitrator(s) may be entered in any court having jurisdiction thereof.</w:t>
+      </w:r>
+    </w:p>
+    <w:p>
+      <w:pPr>
+        <w:pStyle w:val="CLALTRNormal"/>
+        <w:jc w:val="both"/>
+      </w:pPr>
+      <w:r>
+        <w:t>Each person signing this letter agrees (1) that this agreement is entered into in the State of Arizona, (2) that Arizona law governs this agreement, and (</w:t>
+      </w:r>
+      <w:r>
+        <w:t>3</w:t>
+      </w:r>
+      <w:r>
+        <w:t>) each such person consents to the personal jurisdiction of the courts of Maricopa County, Arizona.</w:t>
+      </w:r>
+      <w:r>
+        <w:rPr>
+          <w:rStyle w:val="CLALTRHiddenTextChar"/>
+        </w:rPr>
         <w:t xml:space="preserve"> </w:t>
       </w:r>
       <w:r>
-        <w:t>agree</w:t>
-      </w:r>
-      <w:r>
-        <w:t>s</w:t>
-      </w:r>
-      <w:r>
-        <w:t xml:space="preserve"> that if any statement is not paid within </w:t>
-      </w:r>
-      <w:r>
-        <w:t>thirty (</w:t>
-      </w:r>
-      <w:r>
-        <w:t>30</w:t>
-      </w:r>
-      <w:r>
-        <w:t>)</w:t>
-      </w:r>
-      <w:r>
-        <w:t xml:space="preserve"> days from its </w:t>
-      </w:r>
-      <w:r>
-        <w:t xml:space="preserve">billing </w:t>
-      </w:r>
-      <w:r>
-        <w:t xml:space="preserve">date, the unpaid balance shall accrue interest at the monthly rate of one and one-quarter percent (1.25%), which is an annual percentage rate of 15%. </w:t>
-      </w:r>
-      <w:proofErr w:type="gramStart"/>
-      <w:r>
-        <w:t>In the event that</w:t>
-      </w:r>
-      <w:proofErr w:type="gramEnd"/>
-      <w:r>
-        <w:t xml:space="preserve"> any collection action is required to collect unpaid balances </w:t>
-      </w:r>
-      <w:proofErr w:type="gramStart"/>
-      <w:r>
-        <w:t>due</w:t>
-      </w:r>
-      <w:proofErr w:type="gramEnd"/>
-      <w:r>
-        <w:t xml:space="preserve"> us, </w:t>
-      </w:r>
-      <w:r>
-        <w:t xml:space="preserve">then the Client agrees that ONYX (or any attorney that ONYX may hire for this purpose) may also recover from the Client the </w:t>
-      </w:r>
-      <w:r>
-        <w:t xml:space="preserve">attorneys’ fees and costs to collect such sums, </w:t>
-      </w:r>
-      <w:proofErr w:type="gramStart"/>
-      <w:r>
-        <w:t>whether or not</w:t>
-      </w:r>
-      <w:proofErr w:type="gramEnd"/>
-      <w:r>
-        <w:t xml:space="preserve"> the Client contests the matter.</w:t>
-      </w:r>
-    </w:p>
-    <w:p>
-      <w:pPr>
-        <w:pStyle w:val="CLALTRHeading1"/>
-        <w:jc w:val="both"/>
-      </w:pPr>
-      <w:r>
-        <w:t>Limitation of remedies</w:t>
+        <w:rPr>
+          <w:rStyle w:val="CLALTRHiddenTextChar"/>
+        </w:rPr>
+        <w:t xml:space="preserve">  </w:t>
       </w:r>
     </w:p>
     <w:p>
@@ -4798,7 +4513,7 @@
         <w:jc w:val="both"/>
       </w:pPr>
       <w:r>
-        <w:t xml:space="preserve">ONYX’s role is strictly limited to the engagement described in this letter, and ONYX offers no assurance as to the results or ultimate outcomes of this engagement or of any decisions that the Client may make based on ONYX’s communications with the Client. The Client agrees that it is appropriate to limit the liability of the ONYX Parties.</w:t>
+        <w:t xml:space="preserve">The Client further agrees that it will not hold ONYX or any other ONYX Party liable for any claim, cost, or damage, whether based on warranty, tort, contract, or other law, arising from or related to this agreement, the services provided under this agreement, the work product, or for any plans, actions, or results of this engagement, except to the extent authorized by this agreement.</w:t>
       </w:r>
     </w:p>
     <w:p>
@@ -4807,70 +4522,7 @@
         <w:jc w:val="both"/>
       </w:pPr>
       <w:r>
-        <w:t>If a dispute arises from or relates to this agreement or the breach thereof, and if the dispute cannot be settled through direct discussions, the parties agree to endeavor first to settle the dispute by mediation administered by the American Arbitration Association</w:t>
-      </w:r>
-      <w:r>
-        <w:t xml:space="preserve"> in Maricopa County, Arizona</w:t>
-      </w:r>
-      <w:r>
-        <w:t xml:space="preserve"> under its Commercial Mediation Procedures before resorting to arbitration. The parties further agree that any unresolved controversy or claim arising out of or relating to this agreement, or breach thereof, shall be settled by arbitration administered by the American Arbitration Association</w:t>
-      </w:r>
-      <w:r>
-        <w:t xml:space="preserve"> in Maricopa County, Arizona</w:t>
-      </w:r>
-      <w:r>
-        <w:t xml:space="preserve"> in accordance with its Commercial Arbitration Rules and judgment on the award rendered by the arbitrator(s) may be entered in any court having jurisdiction thereof.</w:t>
-      </w:r>
-    </w:p>
-    <w:p>
-      <w:pPr>
-        <w:pStyle w:val="CLALTRNormal"/>
-        <w:jc w:val="both"/>
-      </w:pPr>
-      <w:r>
-        <w:t>Each person signing this letter agrees (1) that this agreement is entered into in the State of Arizona, (2) that Arizona law governs this agreement, and (</w:t>
-      </w:r>
-      <w:r>
-        <w:t>3</w:t>
-      </w:r>
-      <w:r>
-        <w:t>) each such person consents to the personal jurisdiction of the courts of Maricopa County, Arizona.</w:t>
-      </w:r>
-      <w:r>
-        <w:rPr>
-          <w:rStyle w:val="CLALTRHiddenTextChar"/>
-        </w:rPr>
-        <w:t xml:space="preserve"> </w:t>
-      </w:r>
-      <w:r>
-        <w:rPr>
-          <w:rStyle w:val="CLALTRHiddenTextChar"/>
-        </w:rPr>
-        <w:t xml:space="preserve">  </w:t>
-      </w:r>
-      <w:r>
-        <w:rPr>
-          <w:rStyle w:val="CLALTRHiddenTextChar"/>
-        </w:rPr>
-        <w:endnoteReference w:id="7"/>
-      </w:r>
-    </w:p>
-    <w:p>
-      <w:pPr>
-        <w:pStyle w:val="CLALTRNormal"/>
-        <w:jc w:val="both"/>
-      </w:pPr>
-      <w:r>
-        <w:t xml:space="preserve">The Client further agrees that it will not hold ONYX or any other ONYX Party liable for any claim, cost, or damage, whether based on warranty, tort, contract, or other law, arising from or related to this agreement, the services provided under this agreement, the work product, or for any plans, actions, or results of this engagement, except to the extent authorized by this agreement.</w:t>
-      </w:r>
-    </w:p>
-    <w:p>
-      <w:pPr>
-        <w:pStyle w:val="CLALTRNormal"/>
-        <w:jc w:val="both"/>
-      </w:pPr>
-      <w:r>
-        <w:t xml:space="preserve">To the fullest extent permitted by law, the aggregate liability of all ONYX Parties arising out of or relating to this Agreement, the services provided under this Agreement, or any work product delivered pursuant to this Agreement, regardless of the form of action and whether based in contract, tort, negligence, strict liability, statute, fiduciary theory, or otherwise, shall not exceed the total fees actually paid by Client to ONYX under this Agreement during the twelve (12) months immediately preceding the event giving rise to the claim.</w:t>
+        <w:t xml:space="preserve">To the fullest extent permitted by law, the aggregate liability of all ONYX Parties arising out of or relating to this agreement, the services provided under this agreement, or any work product delivered pursuant to this agreement, regardless of the form of action and whether based in contract, tort, negligence, strict liability, statute, fiduciary theory, or otherwise, shall not exceed the total fees actually paid by Client to ONYX under this agreement during the twelve (12) months immediately preceding the event giving rise to the claim.</w:t>
       </w:r>
     </w:p>
     <w:p>
@@ -5255,7 +4907,7 @@
         <w:t xml:space="preserve">ONYX </w:t>
       </w:r>
       <w:r>
-        <w:t xml:space="preserve">will be responsible for our </w:t>
+        <w:t xml:space="preserve">will be responsible for </w:t>
       </w:r>
       <w:r>
         <w:t xml:space="preserve">its </w:t>
@@ -5391,55 +5043,7 @@
         <w:jc w:val="both"/>
       </w:pPr>
       <w:r>
-        <w:t xml:space="preserve">Accounting standards and procedures will be suggested that are consistent with those normally utilized in an entity of </w:t>
-      </w:r>
-      <w:r>
-        <w:t xml:space="preserve">the Client’s </w:t>
-      </w:r>
-      <w:r>
-        <w:t xml:space="preserve">size and nature. </w:t>
-      </w:r>
-      <w:r>
-        <w:t xml:space="preserve">ONYX </w:t>
-      </w:r>
-      <w:r>
-        <w:t xml:space="preserve">will require </w:t>
-      </w:r>
-      <w:r>
-        <w:t xml:space="preserve">the Client </w:t>
-      </w:r>
-      <w:r>
-        <w:t xml:space="preserve">to approve any changes in the application of accounting standards and procedures </w:t>
-      </w:r>
-      <w:r>
-        <w:t xml:space="preserve">for </w:t>
-      </w:r>
-      <w:r>
-        <w:t xml:space="preserve">the </w:t>
-      </w:r>
-      <w:r>
-        <w:t>Client</w:t>
-      </w:r>
-      <w:r>
-        <w:t xml:space="preserve">. Internal controls may be recommended relating to the safeguarding of the </w:t>
-      </w:r>
-      <w:r>
-        <w:t xml:space="preserve">Client’s </w:t>
-      </w:r>
-      <w:r>
-        <w:t xml:space="preserve">assets. If fraud is initiated by </w:t>
-      </w:r>
-      <w:r>
-        <w:t xml:space="preserve">the Client’s </w:t>
-      </w:r>
-      <w:r>
-        <w:t xml:space="preserve">employees or other service providers, </w:t>
-      </w:r>
-      <w:r>
-        <w:t xml:space="preserve">the Client’s </w:t>
-      </w:r>
-      <w:r>
-        <w:t>insurance is responsible for covering any losses.</w:t>
+        <w:t xml:space="preserve">Accounting standards and procedures will be suggested that are consistent with those normally utilized in an entity of the Client’s size and nature. ONYX will require the Client to approve any changes in the application of accounting standards and procedures for the Client. Internal controls may be recommended relating to the safeguarding of the Client’s assets. If fraud is initiated by the Client’s employees or other service providers, any resulting losses shall be the Client’s responsibility, and the Client shall look first to its own insurance coverage.</w:t>
       </w:r>
     </w:p>
     <w:p>
@@ -5648,7 +5252,7 @@
       </w:r>
       <w:proofErr w:type="spellStart"/>
       <w:r>
-        <w:t>CLient</w:t>
+        <w:t>Client</w:t>
       </w:r>
       <w:proofErr w:type="spellEnd"/>
       <w:r>
@@ -5676,7 +5280,7 @@
         <w:t>ONYX</w:t>
       </w:r>
       <w:r>
-        <w:t xml:space="preserve">, there shall be a refutable presumption that the </w:t>
+        <w:t xml:space="preserve">, there shall be a rebuttable presumption that the </w:t>
       </w:r>
       <w:r>
         <w:t>ONYX</w:t>
@@ -5730,14 +5334,6 @@
         </w:rPr>
         <w:t xml:space="preserve">    </w:t>
       </w:r>
-      <w:r>
-        <w:rPr>
-          <w:rStyle w:val="CLALTRHiddenTextChar"/>
-          <w:b/>
-          <w:i/>
-        </w:rPr>
-        <w:endnoteReference w:id="8"/>
-      </w:r>
     </w:p>
     <w:p>
       <w:pPr>
@@ -5820,7 +5416,7 @@
         <w:jc w:val="both"/>
       </w:pPr>
       <w:r>
-        <w:t xml:space="preserve">ONYX may use third-party software, cloud-based platforms, and advanced technologies, including automated data processing and artificial intelligence tools, to assist in delivering services under this agreement. You acknowledge and authorize ONYX to share and process your data with such providers as necessary to perform the services. These providers may have access to your data solely for the purpose of supporting ONYX’s service delivery. ONYX uses commercially reasonable efforts to select and maintain service providers with appropriate data security and confidentiality standards.</w:t>
+        <w:t xml:space="preserve">ONYX may use third-party software, cloud-based platforms, and advanced technologies, including automated data processing and artificial intelligence tools, to assist in delivering services under this agreement. The Client acknowledges and authorizes ONYX to share and process the Client’s data with such providers as necessary to perform the services. These providers may have access to the Client’s data solely for the purpose of supporting ONYX’s service delivery. ONYX uses commercially reasonable efforts to select and maintain service providers with appropriate data security and confidentiality standards.</w:t>
       </w:r>
     </w:p>
     <w:p>
@@ -5838,7 +5434,7 @@
         <w:jc w:val="both"/>
       </w:pPr>
       <w:r>
-        <w:t xml:space="preserve">Client acknowledges that ONYX may access Client’s accounting systems, banking platforms, payroll systems, software applications, cloud-based services, and other technology systems as reasonably necessary to perform the services described in this Agreement. Client shall remain solely responsible for maintaining the security of its systems, credentials, access permissions, authentication controls, network infrastructure, and data.</w:t>
+        <w:t xml:space="preserve">Client acknowledges that ONYX may access Client’s accounting systems, banking platforms, payroll systems, software applications, cloud-based services, and other technology systems as reasonably necessary to perform the services described in this agreement. Client shall remain solely responsible for maintaining the security of its systems, credentials, access permissions, authentication controls, network infrastructure, and data.</w:t>
       </w:r>
     </w:p>
     <w:p>
@@ -6166,12 +5762,6 @@
           <w:u w:val="single"/>
         </w:rPr>
         <w:tab/>
-      </w:r>
-      <w:r>
-        <w:rPr>
-          <w:rStyle w:val="CLALTRHiddenTextChar"/>
-        </w:rPr>
-        <w:endnoteReference w:id="9"/>
       </w:r>
     </w:p>
     <w:p>
@@ -6352,17 +5942,6 @@
       <w:pPr>
         <w:pStyle w:val="CLALTRHiddenText"/>
       </w:pPr>
-    </w:p>
-    <w:p>
-      <w:pPr>
-        <w:pStyle w:val="CLALTRHiddenText"/>
-      </w:pPr>
-      <w:r>
-        <w:t>CliftonLarsonAllen Guidance and Considerat</w:t>
-      </w:r>
-      <w:r>
-        <w:t>ions</w:t>
-      </w:r>
     </w:p>
     <w:sectPr>
       <w:headerReference w:type="default" r:id="rId16"/>
@@ -6400,1123 +5979,6 @@
       <w:pPr>
         <w:pStyle w:val="CLALTRHiddenText"/>
       </w:pPr>
-    </w:p>
-  </w:endnote>
-  <w:endnote w:id="2">
-    <w:p>
-      <w:pPr>
-        <w:pStyle w:val="CLALTRHiddenText"/>
-        <w:ind w:left="90" w:hanging="90"/>
-      </w:pPr>
-      <w:r>
-        <w:rPr>
-          <w:rStyle w:val="EndnoteReference"/>
-        </w:rPr>
-        <w:endnoteRef/>
-      </w:r>
-      <w:r>
-        <w:t xml:space="preserve"> CliftonLarsonAllen has consulted with our outside attorney and insurance carrier on this engagement letter. Please exercise caution when modifying this engagement letter.</w:t>
-      </w:r>
-    </w:p>
-  </w:endnote>
-  <w:endnote w:id="3">
-    <w:p>
-      <w:pPr>
-        <w:pStyle w:val="CLALTRHiddenText"/>
-      </w:pPr>
-      <w:r>
-        <w:rPr>
-          <w:rStyle w:val="EndnoteReference"/>
-        </w:rPr>
-        <w:endnoteRef/>
-      </w:r>
-      <w:r>
-        <w:t xml:space="preserve"> Template letter </w:t>
-      </w:r>
-      <w:r>
-        <w:t xml:space="preserve">functionality </w:t>
-      </w:r>
-      <w:r>
-        <w:rPr>
-          <w:noProof/>
-        </w:rPr>
-        <w:drawing>
-          <wp:inline distT="0" distB="0" distL="0" distR="0" wp14:anchorId="5ECB53E7" wp14:editId="395EB636">
-            <wp:extent cx="1227802" cy="248421"/>
-            <wp:effectExtent l="19050" t="0" r="0" b="0"/>
-            <wp:docPr id="1" name="Picture 22"/>
-            <wp:cNvGraphicFramePr>
-              <a:graphicFrameLocks xmlns:a="http://schemas.openxmlformats.org/drawingml/2006/main" noChangeAspect="1"/>
-            </wp:cNvGraphicFramePr>
-            <a:graphic xmlns:a="http://schemas.openxmlformats.org/drawingml/2006/main">
-              <a:graphicData uri="http://schemas.openxmlformats.org/drawingml/2006/picture">
-                <pic:pic xmlns:pic="http://schemas.openxmlformats.org/drawingml/2006/picture">
-                  <pic:nvPicPr>
-                    <pic:cNvPr id="0" name="Picture 22"/>
-                    <pic:cNvPicPr>
-                      <a:picLocks noChangeAspect="1" noChangeArrowheads="1"/>
-                    </pic:cNvPicPr>
-                  </pic:nvPicPr>
-                  <pic:blipFill>
-                    <a:blip r:embed="rId1"/>
-                    <a:srcRect l="1832" t="8000" b="8000"/>
-                    <a:stretch>
-                      <a:fillRect/>
-                    </a:stretch>
-                  </pic:blipFill>
-                  <pic:spPr bwMode="auto">
-                    <a:xfrm>
-                      <a:off x="0" y="0"/>
-                      <a:ext cx="1227802" cy="248421"/>
-                    </a:xfrm>
-                    <a:prstGeom prst="rect">
-                      <a:avLst/>
-                    </a:prstGeom>
-                    <a:noFill/>
-                    <a:ln w="9525">
-                      <a:noFill/>
-                      <a:miter lim="800000"/>
-                      <a:headEnd/>
-                      <a:tailEnd/>
-                    </a:ln>
-                  </pic:spPr>
-                </pic:pic>
-              </a:graphicData>
-            </a:graphic>
-          </wp:inline>
-        </w:drawing>
-      </w:r>
-    </w:p>
-    <w:p>
-      <w:pPr>
-        <w:pStyle w:val="CLALTRHiddenText"/>
-        <w:spacing w:after="0"/>
-        <w:ind w:left="90"/>
-      </w:pPr>
-      <w:r>
-        <w:t>F</w:t>
-      </w:r>
-      <w:r>
-        <w:t>ive</w:t>
-      </w:r>
-      <w:r>
-        <w:t xml:space="preserve"> icons were added to the Word quick access toolbar for this template to help you efficiently use it.</w:t>
-      </w:r>
-    </w:p>
-    <w:p>
-      <w:pPr>
-        <w:pStyle w:val="CLALTRHiddenText"/>
-        <w:ind w:left="90"/>
-      </w:pPr>
-      <w:r>
-        <w:t xml:space="preserve">Since computers have different default settings, you may need to change your settings. Click on “Options" </w:t>
-      </w:r>
-      <w:r>
-        <w:rPr>
-          <w:noProof/>
-        </w:rPr>
-        <w:drawing>
-          <wp:inline distT="0" distB="0" distL="0" distR="0" wp14:anchorId="018101AC" wp14:editId="4D29E4F9">
-            <wp:extent cx="192405" cy="231775"/>
-            <wp:effectExtent l="19050" t="0" r="0" b="0"/>
-            <wp:docPr id="6" name="Picture 13"/>
-            <wp:cNvGraphicFramePr>
-              <a:graphicFrameLocks xmlns:a="http://schemas.openxmlformats.org/drawingml/2006/main" noChangeAspect="1"/>
-            </wp:cNvGraphicFramePr>
-            <a:graphic xmlns:a="http://schemas.openxmlformats.org/drawingml/2006/main">
-              <a:graphicData uri="http://schemas.openxmlformats.org/drawingml/2006/picture">
-                <pic:pic xmlns:pic="http://schemas.openxmlformats.org/drawingml/2006/picture">
-                  <pic:nvPicPr>
-                    <pic:cNvPr id="0" name="Picture 13"/>
-                    <pic:cNvPicPr>
-                      <a:picLocks noChangeAspect="1" noChangeArrowheads="1"/>
-                    </pic:cNvPicPr>
-                  </pic:nvPicPr>
-                  <pic:blipFill>
-                    <a:blip r:embed="rId2" cstate="print"/>
-                    <a:srcRect/>
-                    <a:stretch>
-                      <a:fillRect/>
-                    </a:stretch>
-                  </pic:blipFill>
-                  <pic:spPr bwMode="auto">
-                    <a:xfrm>
-                      <a:off x="0" y="0"/>
-                      <a:ext cx="192405" cy="231775"/>
-                    </a:xfrm>
-                    <a:prstGeom prst="rect">
-                      <a:avLst/>
-                    </a:prstGeom>
-                    <a:noFill/>
-                    <a:ln w="9525">
-                      <a:noFill/>
-                      <a:miter lim="800000"/>
-                      <a:headEnd/>
-                      <a:tailEnd/>
-                    </a:ln>
-                  </pic:spPr>
-                </pic:pic>
-              </a:graphicData>
-            </a:graphic>
-          </wp:inline>
-        </w:drawing>
-      </w:r>
-      <w:r>
-        <w:t xml:space="preserve"> on the quick access toolbar. Ensure “Hidden text” and “Print hidden text” are unchecked.</w:t>
-      </w:r>
-    </w:p>
-    <w:p>
-      <w:pPr>
-        <w:pStyle w:val="CLALTRHiddenText"/>
-        <w:ind w:left="720"/>
-      </w:pPr>
-      <w:r>
-        <w:rPr>
-          <w:noProof/>
-        </w:rPr>
-        <w:drawing>
-          <wp:inline distT="0" distB="0" distL="0" distR="0" wp14:anchorId="5B41F4DB" wp14:editId="0C5B570B">
-            <wp:extent cx="3491524" cy="2849217"/>
-            <wp:effectExtent l="19050" t="0" r="0" b="0"/>
-            <wp:docPr id="3" name="Picture 16"/>
-            <wp:cNvGraphicFramePr>
-              <a:graphicFrameLocks xmlns:a="http://schemas.openxmlformats.org/drawingml/2006/main" noChangeAspect="1"/>
-            </wp:cNvGraphicFramePr>
-            <a:graphic xmlns:a="http://schemas.openxmlformats.org/drawingml/2006/main">
-              <a:graphicData uri="http://schemas.openxmlformats.org/drawingml/2006/picture">
-                <pic:pic xmlns:pic="http://schemas.openxmlformats.org/drawingml/2006/picture">
-                  <pic:nvPicPr>
-                    <pic:cNvPr id="0" name="Picture 16"/>
-                    <pic:cNvPicPr>
-                      <a:picLocks noChangeAspect="1" noChangeArrowheads="1"/>
-                    </pic:cNvPicPr>
-                  </pic:nvPicPr>
-                  <pic:blipFill>
-                    <a:blip r:embed="rId3" cstate="print"/>
-                    <a:srcRect/>
-                    <a:stretch>
-                      <a:fillRect/>
-                    </a:stretch>
-                  </pic:blipFill>
-                  <pic:spPr bwMode="auto">
-                    <a:xfrm>
-                      <a:off x="0" y="0"/>
-                      <a:ext cx="3491458" cy="2849163"/>
-                    </a:xfrm>
-                    <a:prstGeom prst="rect">
-                      <a:avLst/>
-                    </a:prstGeom>
-                    <a:noFill/>
-                    <a:ln w="9525">
-                      <a:noFill/>
-                      <a:miter lim="800000"/>
-                      <a:headEnd/>
-                      <a:tailEnd/>
-                    </a:ln>
-                  </pic:spPr>
-                </pic:pic>
-              </a:graphicData>
-            </a:graphic>
-          </wp:inline>
-        </w:drawing>
-      </w:r>
-    </w:p>
-    <w:p>
-      <w:pPr>
-        <w:pStyle w:val="CLALTRHiddenText"/>
-        <w:spacing w:after="120"/>
-      </w:pPr>
-      <w:r>
-        <w:t xml:space="preserve">Red text identifies informational (hidden) text. Click on “Show/Hide” </w:t>
-      </w:r>
-      <w:r>
-        <w:rPr>
-          <w:noProof/>
-        </w:rPr>
-        <w:drawing>
-          <wp:inline distT="0" distB="0" distL="0" distR="0" wp14:anchorId="2727008A" wp14:editId="1E4C62CF">
-            <wp:extent cx="218440" cy="218440"/>
-            <wp:effectExtent l="19050" t="0" r="0" b="0"/>
-            <wp:docPr id="8" name="Picture 22"/>
-            <wp:cNvGraphicFramePr>
-              <a:graphicFrameLocks xmlns:a="http://schemas.openxmlformats.org/drawingml/2006/main" noChangeAspect="1"/>
-            </wp:cNvGraphicFramePr>
-            <a:graphic xmlns:a="http://schemas.openxmlformats.org/drawingml/2006/main">
-              <a:graphicData uri="http://schemas.openxmlformats.org/drawingml/2006/picture">
-                <pic:pic xmlns:pic="http://schemas.openxmlformats.org/drawingml/2006/picture">
-                  <pic:nvPicPr>
-                    <pic:cNvPr id="0" name="Picture 22"/>
-                    <pic:cNvPicPr>
-                      <a:picLocks noChangeAspect="1" noChangeArrowheads="1"/>
-                    </pic:cNvPicPr>
-                  </pic:nvPicPr>
-                  <pic:blipFill>
-                    <a:blip r:embed="rId4" cstate="print"/>
-                    <a:srcRect/>
-                    <a:stretch>
-                      <a:fillRect/>
-                    </a:stretch>
-                  </pic:blipFill>
-                  <pic:spPr bwMode="auto">
-                    <a:xfrm>
-                      <a:off x="0" y="0"/>
-                      <a:ext cx="218440" cy="218440"/>
-                    </a:xfrm>
-                    <a:prstGeom prst="rect">
-                      <a:avLst/>
-                    </a:prstGeom>
-                    <a:noFill/>
-                    <a:ln w="9525">
-                      <a:noFill/>
-                      <a:miter lim="800000"/>
-                      <a:headEnd/>
-                      <a:tailEnd/>
-                    </a:ln>
-                  </pic:spPr>
-                </pic:pic>
-              </a:graphicData>
-            </a:graphic>
-          </wp:inline>
-        </w:drawing>
-      </w:r>
-      <w:r>
-        <w:t xml:space="preserve"> on the quick access toolbar to show or hide hidden text. Hidden text will not print. </w:t>
-      </w:r>
-    </w:p>
-    <w:p>
-      <w:pPr>
-        <w:pStyle w:val="CLALTRHiddenText"/>
-        <w:spacing w:after="0"/>
-      </w:pPr>
-      <w:r>
-        <w:rPr>
-          <w:highlight w:val="yellow"/>
-        </w:rPr>
-        <w:t>Yellow shaded text indicates text which may or may not be needed in the specific client circumstances. Edit</w:t>
-      </w:r>
-      <w:r>
-        <w:rPr>
-          <w:highlight w:val="yellow"/>
-        </w:rPr>
-        <w:t>, delete,</w:t>
-      </w:r>
-      <w:r>
-        <w:rPr>
-          <w:highlight w:val="yellow"/>
-        </w:rPr>
-        <w:t xml:space="preserve"> or retain as appropriate for the client. </w:t>
-      </w:r>
-    </w:p>
-    <w:p>
-      <w:pPr>
-        <w:pStyle w:val="CLALTRHiddenText"/>
-      </w:pPr>
-      <w:r>
-        <w:t xml:space="preserve">Endnotes include hidden text. If you want to view the endnote popup, click “Options” </w:t>
-      </w:r>
-      <w:r>
-        <w:rPr>
-          <w:noProof/>
-        </w:rPr>
-        <w:drawing>
-          <wp:inline distT="0" distB="0" distL="0" distR="0" wp14:anchorId="73776D46" wp14:editId="47A7FA9C">
-            <wp:extent cx="192405" cy="231775"/>
-            <wp:effectExtent l="19050" t="0" r="0" b="0"/>
-            <wp:docPr id="10" name="Picture 13"/>
-            <wp:cNvGraphicFramePr>
-              <a:graphicFrameLocks xmlns:a="http://schemas.openxmlformats.org/drawingml/2006/main" noChangeAspect="1"/>
-            </wp:cNvGraphicFramePr>
-            <a:graphic xmlns:a="http://schemas.openxmlformats.org/drawingml/2006/main">
-              <a:graphicData uri="http://schemas.openxmlformats.org/drawingml/2006/picture">
-                <pic:pic xmlns:pic="http://schemas.openxmlformats.org/drawingml/2006/picture">
-                  <pic:nvPicPr>
-                    <pic:cNvPr id="0" name="Picture 13"/>
-                    <pic:cNvPicPr>
-                      <a:picLocks noChangeAspect="1" noChangeArrowheads="1"/>
-                    </pic:cNvPicPr>
-                  </pic:nvPicPr>
-                  <pic:blipFill>
-                    <a:blip r:embed="rId2" cstate="print"/>
-                    <a:srcRect/>
-                    <a:stretch>
-                      <a:fillRect/>
-                    </a:stretch>
-                  </pic:blipFill>
-                  <pic:spPr bwMode="auto">
-                    <a:xfrm>
-                      <a:off x="0" y="0"/>
-                      <a:ext cx="192405" cy="231775"/>
-                    </a:xfrm>
-                    <a:prstGeom prst="rect">
-                      <a:avLst/>
-                    </a:prstGeom>
-                    <a:noFill/>
-                    <a:ln w="9525">
-                      <a:noFill/>
-                      <a:miter lim="800000"/>
-                      <a:headEnd/>
-                      <a:tailEnd/>
-                    </a:ln>
-                  </pic:spPr>
-                </pic:pic>
-              </a:graphicData>
-            </a:graphic>
-          </wp:inline>
-        </w:drawing>
-      </w:r>
-      <w:r>
-        <w:t xml:space="preserve"> on the quick access tool bar, and check “Hidden text” in the “Always show these formatting marks on the screen” section. You will need to uncheck again to hide the text if you want to view the text in order to insert appropriate page breaks before printing.</w:t>
-      </w:r>
-    </w:p>
-    <w:p>
-      <w:pPr>
-        <w:pStyle w:val="CLALTRHiddenText"/>
-      </w:pPr>
-      <w:r>
-        <w:t xml:space="preserve">Click on shaded form fields and type appropriate text. (This replaces the content and eliminates the form field.) Alternatively, click “Lock” </w:t>
-      </w:r>
-      <w:r>
-        <w:rPr>
-          <w:noProof/>
-        </w:rPr>
-        <w:drawing>
-          <wp:inline distT="0" distB="0" distL="0" distR="0" wp14:anchorId="124606F8" wp14:editId="238618D5">
-            <wp:extent cx="192372" cy="179582"/>
-            <wp:effectExtent l="19050" t="0" r="0" b="0"/>
-            <wp:docPr id="11" name="Picture 19"/>
-            <wp:cNvGraphicFramePr>
-              <a:graphicFrameLocks xmlns:a="http://schemas.openxmlformats.org/drawingml/2006/main" noChangeAspect="1"/>
-            </wp:cNvGraphicFramePr>
-            <a:graphic xmlns:a="http://schemas.openxmlformats.org/drawingml/2006/main">
-              <a:graphicData uri="http://schemas.openxmlformats.org/drawingml/2006/picture">
-                <pic:pic xmlns:pic="http://schemas.openxmlformats.org/drawingml/2006/picture">
-                  <pic:nvPicPr>
-                    <pic:cNvPr id="0" name="Picture 19"/>
-                    <pic:cNvPicPr>
-                      <a:picLocks noChangeAspect="1" noChangeArrowheads="1"/>
-                    </pic:cNvPicPr>
-                  </pic:nvPicPr>
-                  <pic:blipFill>
-                    <a:blip r:embed="rId5" cstate="print"/>
-                    <a:srcRect t="10475"/>
-                    <a:stretch>
-                      <a:fillRect/>
-                    </a:stretch>
-                  </pic:blipFill>
-                  <pic:spPr bwMode="auto">
-                    <a:xfrm>
-                      <a:off x="0" y="0"/>
-                      <a:ext cx="192372" cy="179582"/>
-                    </a:xfrm>
-                    <a:prstGeom prst="rect">
-                      <a:avLst/>
-                    </a:prstGeom>
-                    <a:noFill/>
-                    <a:ln w="9525">
-                      <a:noFill/>
-                      <a:miter lim="800000"/>
-                      <a:headEnd/>
-                      <a:tailEnd/>
-                    </a:ln>
-                  </pic:spPr>
-                </pic:pic>
-              </a:graphicData>
-            </a:graphic>
-          </wp:inline>
-        </w:drawing>
-      </w:r>
-      <w:r>
-        <w:t xml:space="preserve"> in the quick access toolbar to lock the document so you may tab through the form fields in the document to edit the text in the form fields. The locking feature can be toggled on and off with this icon. (Use Shift + Tab to move to the previous field.) </w:t>
-      </w:r>
-    </w:p>
-    <w:p>
-      <w:pPr>
-        <w:pStyle w:val="CLALTRHiddenText"/>
-      </w:pPr>
-      <w:r>
-        <w:t>Styles can be used to efficiently format added content copied from another document. (Styles are available on the Home ribbon.) Styles can be used to efficiently change optional text to hidden text to exclude from the letter for the current period but retain for evaluation in subsequent periods. (Use Word’s “Bullets” feature as needed.)</w:t>
-      </w:r>
-    </w:p>
-    <w:p>
-      <w:pPr>
-        <w:pStyle w:val="CLALTRHiddenText"/>
-        <w:ind w:left="720"/>
-      </w:pPr>
-      <w:r>
-        <w:rPr>
-          <w:noProof/>
-        </w:rPr>
-        <w:drawing>
-          <wp:inline distT="0" distB="0" distL="0" distR="0" wp14:anchorId="6A737AD1" wp14:editId="6B3BA327">
-            <wp:extent cx="1368879" cy="3286436"/>
-            <wp:effectExtent l="19050" t="0" r="2721" b="0"/>
-            <wp:docPr id="12" name="Picture 34"/>
-            <wp:cNvGraphicFramePr>
-              <a:graphicFrameLocks xmlns:a="http://schemas.openxmlformats.org/drawingml/2006/main" noChangeAspect="1"/>
-            </wp:cNvGraphicFramePr>
-            <a:graphic xmlns:a="http://schemas.openxmlformats.org/drawingml/2006/main">
-              <a:graphicData uri="http://schemas.openxmlformats.org/drawingml/2006/picture">
-                <pic:pic xmlns:pic="http://schemas.openxmlformats.org/drawingml/2006/picture">
-                  <pic:nvPicPr>
-                    <pic:cNvPr id="0" name="Picture 34"/>
-                    <pic:cNvPicPr>
-                      <a:picLocks noChangeAspect="1" noChangeArrowheads="1"/>
-                    </pic:cNvPicPr>
-                  </pic:nvPicPr>
-                  <pic:blipFill>
-                    <a:blip r:embed="rId6"/>
-                    <a:srcRect l="1206" b="1004"/>
-                    <a:stretch>
-                      <a:fillRect/>
-                    </a:stretch>
-                  </pic:blipFill>
-                  <pic:spPr bwMode="auto">
-                    <a:xfrm>
-                      <a:off x="0" y="0"/>
-                      <a:ext cx="1370447" cy="3290202"/>
-                    </a:xfrm>
-                    <a:prstGeom prst="rect">
-                      <a:avLst/>
-                    </a:prstGeom>
-                    <a:noFill/>
-                    <a:ln w="9525">
-                      <a:noFill/>
-                      <a:miter lim="800000"/>
-                      <a:headEnd/>
-                      <a:tailEnd/>
-                    </a:ln>
-                  </pic:spPr>
-                </pic:pic>
-              </a:graphicData>
-            </a:graphic>
-          </wp:inline>
-        </w:drawing>
-      </w:r>
-    </w:p>
-    <w:p>
-      <w:pPr>
-        <w:pStyle w:val="CLALTRHiddenText"/>
-      </w:pPr>
-      <w:r>
-        <w:t>Printing:</w:t>
-      </w:r>
-    </w:p>
-    <w:p>
-      <w:pPr>
-        <w:pStyle w:val="CLALTRHiddenText"/>
-        <w:numPr>
-          <w:ilvl w:val="0"/>
-          <w:numId w:val="4"/>
-        </w:numPr>
-        <w:spacing w:after="120"/>
-        <w:ind w:left="360"/>
-      </w:pPr>
-      <w:r>
-        <w:t xml:space="preserve">If sending the letter electronically, print the letter to firm letterhead, the </w:t>
-      </w:r>
-      <w:r>
-        <w:t>principal</w:t>
-      </w:r>
-      <w:r>
-        <w:t xml:space="preserve"> should sign the letter, and then the letter can be scanned and sent to the client. Alternatively, insert the firm’s letterhead and the </w:t>
-      </w:r>
-      <w:r>
-        <w:t>principal</w:t>
-      </w:r>
-      <w:r>
-        <w:t>’s electronic signature, print to Adobe, and send the Adobe file. Do not send the Word document because hidden text would be accessible by the client.</w:t>
-      </w:r>
-    </w:p>
-    <w:p>
-      <w:pPr>
-        <w:pStyle w:val="CLALTRHiddenText"/>
-        <w:numPr>
-          <w:ilvl w:val="0"/>
-          <w:numId w:val="4"/>
-        </w:numPr>
-        <w:spacing w:after="120"/>
-        <w:ind w:left="360"/>
-      </w:pPr>
-      <w:r>
-        <w:t>Complete the date and client name in the header fields on the second page. If the client name was linked, you may need to click the ProSystem fx Engagement “Refresh</w:t>
-      </w:r>
-      <w:r>
-        <w:t xml:space="preserve">” icon </w:t>
-      </w:r>
-      <w:r>
-        <w:rPr>
-          <w:noProof/>
-        </w:rPr>
-        <w:drawing>
-          <wp:inline distT="0" distB="0" distL="0" distR="0" wp14:anchorId="69EEF957" wp14:editId="0FE06749">
-            <wp:extent cx="191729" cy="198120"/>
-            <wp:effectExtent l="19050" t="0" r="0" b="0"/>
-            <wp:docPr id="15" name="Picture 1"/>
-            <wp:cNvGraphicFramePr>
-              <a:graphicFrameLocks xmlns:a="http://schemas.openxmlformats.org/drawingml/2006/main" noChangeAspect="1"/>
-            </wp:cNvGraphicFramePr>
-            <a:graphic xmlns:a="http://schemas.openxmlformats.org/drawingml/2006/main">
-              <a:graphicData uri="http://schemas.openxmlformats.org/drawingml/2006/picture">
-                <pic:pic xmlns:pic="http://schemas.openxmlformats.org/drawingml/2006/picture">
-                  <pic:nvPicPr>
-                    <pic:cNvPr id="0" name="Picture 1"/>
-                    <pic:cNvPicPr>
-                      <a:picLocks noChangeAspect="1" noChangeArrowheads="1"/>
-                    </pic:cNvPicPr>
-                  </pic:nvPicPr>
-                  <pic:blipFill>
-                    <a:blip r:embed="rId7"/>
-                    <a:srcRect/>
-                    <a:stretch>
-                      <a:fillRect/>
-                    </a:stretch>
-                  </pic:blipFill>
-                  <pic:spPr bwMode="auto">
-                    <a:xfrm>
-                      <a:off x="0" y="0"/>
-                      <a:ext cx="191729" cy="198120"/>
-                    </a:xfrm>
-                    <a:prstGeom prst="rect">
-                      <a:avLst/>
-                    </a:prstGeom>
-                    <a:noFill/>
-                    <a:ln w="9525">
-                      <a:noFill/>
-                      <a:miter lim="800000"/>
-                      <a:headEnd/>
-                      <a:tailEnd/>
-                    </a:ln>
-                  </pic:spPr>
-                </pic:pic>
-              </a:graphicData>
-            </a:graphic>
-          </wp:inline>
-        </w:drawing>
-      </w:r>
-      <w:r>
-        <w:t xml:space="preserve"> to</w:t>
-      </w:r>
-      <w:r>
-        <w:t xml:space="preserve"> update the link.</w:t>
-      </w:r>
-    </w:p>
-    <w:p>
-      <w:pPr>
-        <w:pStyle w:val="CLALTRHiddenText"/>
-        <w:numPr>
-          <w:ilvl w:val="0"/>
-          <w:numId w:val="4"/>
-        </w:numPr>
-        <w:spacing w:after="120"/>
-        <w:ind w:left="360"/>
-      </w:pPr>
-      <w:r>
-        <w:rPr>
-          <w:highlight w:val="yellow"/>
-        </w:rPr>
-        <w:t xml:space="preserve">Yellow highlighting needs to be eliminated before printing. </w:t>
-      </w:r>
-      <w:r>
-        <w:rPr>
-          <w:highlight w:val="yellow"/>
-        </w:rPr>
-        <w:t xml:space="preserve">From the “Home” ribbon, choose “Select” and “Select All,” to highlight the </w:t>
-      </w:r>
-      <w:r>
-        <w:rPr>
-          <w:highlight w:val="yellow"/>
-        </w:rPr>
-        <w:t xml:space="preserve">content of the </w:t>
-      </w:r>
-      <w:r>
-        <w:rPr>
-          <w:highlight w:val="yellow"/>
-        </w:rPr>
-        <w:t>entire letter</w:t>
-      </w:r>
-      <w:r>
-        <w:rPr>
-          <w:highlight w:val="yellow"/>
-        </w:rPr>
-        <w:t>; then</w:t>
-      </w:r>
-      <w:r>
-        <w:rPr>
-          <w:highlight w:val="yellow"/>
-        </w:rPr>
-        <w:t xml:space="preserve"> click on</w:t>
-      </w:r>
-      <w:r>
-        <w:rPr>
-          <w:highlight w:val="yellow"/>
-        </w:rPr>
-        <w:t xml:space="preserve"> the</w:t>
-      </w:r>
-      <w:r>
-        <w:rPr>
-          <w:highlight w:val="yellow"/>
-        </w:rPr>
-        <w:t xml:space="preserve"> “Text Highlight Color” </w:t>
-      </w:r>
-      <w:r>
-        <w:rPr>
-          <w:noProof/>
-          <w:highlight w:val="yellow"/>
-        </w:rPr>
-        <w:drawing>
-          <wp:inline distT="0" distB="0" distL="0" distR="0" wp14:anchorId="2EE7057B" wp14:editId="6FCA0EBB">
-            <wp:extent cx="292797" cy="239070"/>
-            <wp:effectExtent l="19050" t="0" r="0" b="0"/>
-            <wp:docPr id="16" name="Picture 16"/>
-            <wp:cNvGraphicFramePr>
-              <a:graphicFrameLocks xmlns:a="http://schemas.openxmlformats.org/drawingml/2006/main" noChangeAspect="1"/>
-            </wp:cNvGraphicFramePr>
-            <a:graphic xmlns:a="http://schemas.openxmlformats.org/drawingml/2006/main">
-              <a:graphicData uri="http://schemas.openxmlformats.org/drawingml/2006/picture">
-                <pic:pic xmlns:pic="http://schemas.openxmlformats.org/drawingml/2006/picture">
-                  <pic:nvPicPr>
-                    <pic:cNvPr id="0" name="Picture 16"/>
-                    <pic:cNvPicPr>
-                      <a:picLocks noChangeAspect="1" noChangeArrowheads="1"/>
-                    </pic:cNvPicPr>
-                  </pic:nvPicPr>
-                  <pic:blipFill>
-                    <a:blip r:embed="rId8"/>
-                    <a:srcRect t="8000" b="8000"/>
-                    <a:stretch>
-                      <a:fillRect/>
-                    </a:stretch>
-                  </pic:blipFill>
-                  <pic:spPr bwMode="auto">
-                    <a:xfrm>
-                      <a:off x="0" y="0"/>
-                      <a:ext cx="292797" cy="239070"/>
-                    </a:xfrm>
-                    <a:prstGeom prst="rect">
-                      <a:avLst/>
-                    </a:prstGeom>
-                    <a:noFill/>
-                    <a:ln w="9525">
-                      <a:noFill/>
-                      <a:miter lim="800000"/>
-                      <a:headEnd/>
-                      <a:tailEnd/>
-                    </a:ln>
-                  </pic:spPr>
-                </pic:pic>
-              </a:graphicData>
-            </a:graphic>
-          </wp:inline>
-        </w:drawing>
-      </w:r>
-      <w:r>
-        <w:rPr>
-          <w:highlight w:val="yellow"/>
-        </w:rPr>
-        <w:t xml:space="preserve"> </w:t>
-      </w:r>
-      <w:r>
-        <w:rPr>
-          <w:highlight w:val="yellow"/>
-        </w:rPr>
-        <w:t xml:space="preserve">arrow </w:t>
-      </w:r>
-      <w:r>
-        <w:rPr>
-          <w:highlight w:val="yellow"/>
-        </w:rPr>
-        <w:t xml:space="preserve">on the quick access toolbar and choose </w:t>
-      </w:r>
-      <w:r>
-        <w:rPr>
-          <w:highlight w:val="yellow"/>
-        </w:rPr>
-        <w:t>“</w:t>
-      </w:r>
-      <w:r>
-        <w:rPr>
-          <w:highlight w:val="yellow"/>
-        </w:rPr>
-        <w:t>No Color</w:t>
-      </w:r>
-      <w:r>
-        <w:rPr>
-          <w:highlight w:val="yellow"/>
-        </w:rPr>
-        <w:t>.”</w:t>
-      </w:r>
-    </w:p>
-    <w:p>
-      <w:pPr>
-        <w:pStyle w:val="CLALTRHiddenText"/>
-        <w:numPr>
-          <w:ilvl w:val="0"/>
-          <w:numId w:val="4"/>
-        </w:numPr>
-        <w:spacing w:after="120"/>
-        <w:ind w:left="360"/>
-      </w:pPr>
-      <w:r>
-        <w:t>Click “Form Field Shading”</w:t>
-      </w:r>
-      <w:r>
-        <w:t xml:space="preserve"> </w:t>
-      </w:r>
-      <w:r>
-        <w:rPr>
-          <w:noProof/>
-        </w:rPr>
-        <w:drawing>
-          <wp:inline distT="0" distB="0" distL="0" distR="0" wp14:anchorId="35A40DFA" wp14:editId="71B8F4D4">
-            <wp:extent cx="176936" cy="170383"/>
-            <wp:effectExtent l="19050" t="0" r="0" b="0"/>
-            <wp:docPr id="17" name="Picture 25"/>
-            <wp:cNvGraphicFramePr>
-              <a:graphicFrameLocks xmlns:a="http://schemas.openxmlformats.org/drawingml/2006/main" noChangeAspect="1"/>
-            </wp:cNvGraphicFramePr>
-            <a:graphic xmlns:a="http://schemas.openxmlformats.org/drawingml/2006/main">
-              <a:graphicData uri="http://schemas.openxmlformats.org/drawingml/2006/picture">
-                <pic:pic xmlns:pic="http://schemas.openxmlformats.org/drawingml/2006/picture">
-                  <pic:nvPicPr>
-                    <pic:cNvPr id="0" name="Picture 25"/>
-                    <pic:cNvPicPr>
-                      <a:picLocks noChangeAspect="1" noChangeArrowheads="1"/>
-                    </pic:cNvPicPr>
-                  </pic:nvPicPr>
-                  <pic:blipFill>
-                    <a:blip r:embed="rId9"/>
-                    <a:srcRect/>
-                    <a:stretch>
-                      <a:fillRect/>
-                    </a:stretch>
-                  </pic:blipFill>
-                  <pic:spPr bwMode="auto">
-                    <a:xfrm>
-                      <a:off x="0" y="0"/>
-                      <a:ext cx="176936" cy="170383"/>
-                    </a:xfrm>
-                    <a:prstGeom prst="rect">
-                      <a:avLst/>
-                    </a:prstGeom>
-                    <a:noFill/>
-                    <a:ln w="9525">
-                      <a:noFill/>
-                      <a:miter lim="800000"/>
-                      <a:headEnd/>
-                      <a:tailEnd/>
-                    </a:ln>
-                  </pic:spPr>
-                </pic:pic>
-              </a:graphicData>
-            </a:graphic>
-          </wp:inline>
-        </w:drawing>
-      </w:r>
-      <w:r>
-        <w:t xml:space="preserve"> on the quick access toolbar to eliminate field shading before printing.</w:t>
-      </w:r>
-    </w:p>
-    <w:p>
-      <w:pPr>
-        <w:pStyle w:val="CLALTRHiddenText"/>
-        <w:numPr>
-          <w:ilvl w:val="0"/>
-          <w:numId w:val="4"/>
-        </w:numPr>
-        <w:ind w:left="360"/>
-      </w:pPr>
-      <w:r>
-        <w:t xml:space="preserve">If hidden text is printing, click on “Options” </w:t>
-      </w:r>
-      <w:r>
-        <w:rPr>
-          <w:noProof/>
-        </w:rPr>
-        <w:drawing>
-          <wp:inline distT="0" distB="0" distL="0" distR="0" wp14:anchorId="5F954E04" wp14:editId="7DDEE9F5">
-            <wp:extent cx="192405" cy="231775"/>
-            <wp:effectExtent l="19050" t="0" r="0" b="0"/>
-            <wp:docPr id="18" name="Picture 13"/>
-            <wp:cNvGraphicFramePr>
-              <a:graphicFrameLocks xmlns:a="http://schemas.openxmlformats.org/drawingml/2006/main" noChangeAspect="1"/>
-            </wp:cNvGraphicFramePr>
-            <a:graphic xmlns:a="http://schemas.openxmlformats.org/drawingml/2006/main">
-              <a:graphicData uri="http://schemas.openxmlformats.org/drawingml/2006/picture">
-                <pic:pic xmlns:pic="http://schemas.openxmlformats.org/drawingml/2006/picture">
-                  <pic:nvPicPr>
-                    <pic:cNvPr id="0" name="Picture 13"/>
-                    <pic:cNvPicPr>
-                      <a:picLocks noChangeAspect="1" noChangeArrowheads="1"/>
-                    </pic:cNvPicPr>
-                  </pic:nvPicPr>
-                  <pic:blipFill>
-                    <a:blip r:embed="rId2" cstate="print"/>
-                    <a:srcRect/>
-                    <a:stretch>
-                      <a:fillRect/>
-                    </a:stretch>
-                  </pic:blipFill>
-                  <pic:spPr bwMode="auto">
-                    <a:xfrm>
-                      <a:off x="0" y="0"/>
-                      <a:ext cx="192405" cy="231775"/>
-                    </a:xfrm>
-                    <a:prstGeom prst="rect">
-                      <a:avLst/>
-                    </a:prstGeom>
-                    <a:noFill/>
-                    <a:ln w="9525">
-                      <a:noFill/>
-                      <a:miter lim="800000"/>
-                      <a:headEnd/>
-                      <a:tailEnd/>
-                    </a:ln>
-                  </pic:spPr>
-                </pic:pic>
-              </a:graphicData>
-            </a:graphic>
-          </wp:inline>
-        </w:drawing>
-      </w:r>
-      <w:r>
-        <w:t xml:space="preserve"> and uncheck “Print hidden text” under “Printing options.”</w:t>
-      </w:r>
-    </w:p>
-  </w:endnote>
-  <w:endnote w:id="4">
-    <w:p>
-      <w:pPr>
-        <w:pStyle w:val="CLALTRHiddenText"/>
-        <w:ind w:left="90" w:hanging="90"/>
-      </w:pPr>
-      <w:r>
-        <w:rPr>
-          <w:rStyle w:val="EndnoteReference"/>
-        </w:rPr>
-        <w:endnoteRef/>
-      </w:r>
-      <w:r>
-        <w:t xml:space="preserve"> Use separate engagement letters for other services CLA provides (for example, an agreed-upon procedures engagement or a consulting engagement).</w:t>
-      </w:r>
-    </w:p>
-  </w:endnote>
-  <w:endnote w:id="5">
-    <w:p>
-      <w:pPr>
-        <w:pStyle w:val="CLALTRHiddenText"/>
-        <w:ind w:left="90" w:hanging="90"/>
-      </w:pPr>
-      <w:r>
-        <w:rPr>
-          <w:rStyle w:val="EndnoteReference"/>
-        </w:rPr>
-        <w:endnoteRef/>
-      </w:r>
-      <w:r>
-        <w:t xml:space="preserve"> The addresses and references in the engagement letter should be those that are appropriate in the circumstances of the engagement. </w:t>
-      </w:r>
-      <w:r>
-        <w:t>Depending on the entity's structure, the agreement may be with management, those charged with governance, or both. Nonetheless, when the agreement on the terms of engagement is only with those charged with governance, in accordance with paragraph .25c of section 60, the accountant is required to obtain management's agreement that it acknowledges and understands its responsibilities.</w:t>
-      </w:r>
-      <w:r>
-        <w:t xml:space="preserve"> SSARSs define management: “</w:t>
-      </w:r>
-      <w:r>
-        <w:t>The person(s) with executive responsibility for the conduct of the entity's operations. For some entities, management includes some or all of those charged with governance (for example, executive members of a governance board or an owner-manager).</w:t>
-      </w:r>
-      <w:r>
-        <w:t>”</w:t>
-      </w:r>
-    </w:p>
-  </w:endnote>
-  <w:endnote w:id="6">
-    <w:p>
-      <w:pPr>
-        <w:pStyle w:val="CLALTRHiddenText"/>
-      </w:pPr>
-      <w:r>
-        <w:rPr>
-          <w:rStyle w:val="EndnoteReference"/>
-        </w:rPr>
-        <w:endnoteRef/>
-      </w:r>
-      <w:r>
-        <w:t xml:space="preserve"> CLA</w:t>
-      </w:r>
-      <w:r>
-        <w:t xml:space="preserve"> suggests this be 30 days. </w:t>
-      </w:r>
-      <w:r>
-        <w:t>It should not</w:t>
-      </w:r>
-      <w:r>
-        <w:t xml:space="preserve"> be greater than 60 days.</w:t>
-      </w:r>
-    </w:p>
-  </w:endnote>
-  <w:endnote w:id="7">
-    <w:p>
-      <w:pPr>
-        <w:pStyle w:val="CLALTRHiddenText"/>
-        <w:ind w:left="180" w:hanging="180"/>
-      </w:pPr>
-      <w:r>
-        <w:rPr>
-          <w:rStyle w:val="EndnoteReference"/>
-        </w:rPr>
-        <w:endnoteRef/>
-      </w:r>
-      <w:r>
-        <w:t xml:space="preserve"> If the client requests that we change the state, the engagement principal may propose omitting the paragraph as a compromise. We include Minnesota because we are legally a Minnesota partnership. If you have additional questions or concerns, or if there is continued resistance from the client, consult with CLA’s general counsel, chief legal officer, or chief quality officer.</w:t>
-      </w:r>
-    </w:p>
-  </w:endnote>
-  <w:endnote w:id="8">
-    <w:p>
-      <w:pPr>
-        <w:pStyle w:val="CLALTRHiddenText"/>
-        <w:ind w:left="180" w:hanging="180"/>
-      </w:pPr>
-      <w:r>
-        <w:rPr>
-          <w:rStyle w:val="EndnoteReference"/>
-        </w:rPr>
-        <w:endnoteRef/>
-      </w:r>
-      <w:r>
-        <w:t xml:space="preserve"> This paragraph is generally included in all engagement letters. If the client requests, it may be deleted. If deleted, the engagement principal must ensure we provide the services without using a third-party service provider. The paragraph is required if we are using an entity or individual not employed or controlled by CLA to assist us in providing professional services to the client. </w:t>
-      </w:r>
-    </w:p>
-    <w:p>
-      <w:pPr>
-        <w:pStyle w:val="CLALTRHiddenText"/>
-        <w:ind w:left="180"/>
-      </w:pPr>
-      <w:r>
-        <w:t>Note – Examples of entities that assist us in providing professional services to clients include:</w:t>
-      </w:r>
-    </w:p>
-    <w:p>
-      <w:pPr>
-        <w:pStyle w:val="CLALTRHiddenText"/>
-        <w:numPr>
-          <w:ilvl w:val="0"/>
-          <w:numId w:val="7"/>
-        </w:numPr>
-        <w:ind w:left="720" w:hanging="360"/>
-      </w:pPr>
-      <w:r>
-        <w:t>Other accounting firms (for example, to observe or count inventory).</w:t>
-      </w:r>
-    </w:p>
-    <w:p>
-      <w:pPr>
-        <w:pStyle w:val="CLALTRHiddenText"/>
-        <w:numPr>
-          <w:ilvl w:val="0"/>
-          <w:numId w:val="7"/>
-        </w:numPr>
-        <w:ind w:left="720" w:hanging="360"/>
-      </w:pPr>
-      <w:r>
-        <w:t>Specialists (for example, to value assets).</w:t>
-      </w:r>
-    </w:p>
-    <w:p>
-      <w:pPr>
-        <w:pStyle w:val="CLALTRHiddenText"/>
-        <w:numPr>
-          <w:ilvl w:val="0"/>
-          <w:numId w:val="7"/>
-        </w:numPr>
-        <w:ind w:left="720" w:hanging="360"/>
-      </w:pPr>
-      <w:r>
-        <w:t>Independent contractors, including temporary workers who are not on CLA's payroll (for example, for outsourced accounting, tax preparation, or word processing services).</w:t>
-      </w:r>
-    </w:p>
-    <w:p>
-      <w:pPr>
-        <w:pStyle w:val="CLALTRHiddenText"/>
-        <w:ind w:left="180"/>
-      </w:pPr>
-      <w:r>
-        <w:t>Note - Communication with the client is not required for third-party service providers who provide administrative support services. Examples of administrative support services include:</w:t>
-      </w:r>
-    </w:p>
-    <w:p>
-      <w:pPr>
-        <w:pStyle w:val="CLALTRHiddenText"/>
-        <w:numPr>
-          <w:ilvl w:val="0"/>
-          <w:numId w:val="7"/>
-        </w:numPr>
-        <w:ind w:left="720" w:hanging="360"/>
-      </w:pPr>
-      <w:r>
-        <w:t>Record storage.</w:t>
-      </w:r>
-    </w:p>
-    <w:p>
-      <w:pPr>
-        <w:pStyle w:val="CLALTRHiddenText"/>
-        <w:numPr>
-          <w:ilvl w:val="0"/>
-          <w:numId w:val="7"/>
-        </w:numPr>
-        <w:ind w:left="720" w:hanging="360"/>
-      </w:pPr>
-      <w:r>
-        <w:t>Software application hosting.</w:t>
-      </w:r>
-    </w:p>
-    <w:p>
-      <w:pPr>
-        <w:pStyle w:val="CLALTRHiddenText"/>
-        <w:numPr>
-          <w:ilvl w:val="0"/>
-          <w:numId w:val="7"/>
-        </w:numPr>
-        <w:ind w:left="720" w:hanging="360"/>
-      </w:pPr>
-      <w:r>
-        <w:t>Authorized e-file tax transmittal.</w:t>
-      </w:r>
-    </w:p>
-    <w:p>
-      <w:pPr>
-        <w:pStyle w:val="CLALTRHiddenText"/>
-        <w:ind w:left="180"/>
-      </w:pPr>
-      <w:r>
-        <w:t>For additional information, see ET 0.400.47 for a definition of a third-party service provider and ET 1.150 Use of a Third-Party Service Provider [Prior reference: Ethics Rulings 191.112 and 391.1] in the AICPA Code of Professional Conduct.</w:t>
-      </w:r>
-    </w:p>
-  </w:endnote>
-  <w:endnote w:id="9">
-    <w:p>
-      <w:pPr>
-        <w:pStyle w:val="CLALTRHiddenText"/>
-        <w:ind w:left="180" w:hanging="180"/>
-      </w:pPr>
-      <w:r>
-        <w:rPr>
-          <w:rStyle w:val="EndnoteReference"/>
-        </w:rPr>
-        <w:endnoteRef/>
-      </w:r>
-      <w:r>
-        <w:t xml:space="preserve"> The accountant should agree upon the terms of the engagement with management or those charged with governance, as appropriate. (AR-C 70.10)</w:t>
-      </w:r>
-    </w:p>
-    <w:p>
-      <w:pPr>
-        <w:pStyle w:val="CLALTRHiddenText"/>
-        <w:ind w:left="180"/>
-      </w:pPr>
-      <w:r>
-        <w:t>The roles of management and those charged with governance in agreeing upon the terms of the preparation engagement for the entity depend on the governance structure of the entity and relevant law or regulation. Depending on the entity's structure, the agreement may be with management, those charged with governance, or both. Nonetheless, when the agreement on the terms of engagement is only with those charged with governance, in accordance with paragraph .25c of section 60, the accountant is required to obtain management's agreement that it acknowledges and understands its responsibilities. (AR-C 70.A8)</w:t>
-      </w:r>
     </w:p>
   </w:endnote>
 </w:endnotes>

</xml_diff>

<commit_message>
Rewrite Scope in sales-forward voice; clarity pass on highlighted content
- Scope: value-framing intro, client-facing headers, benefit-led bullets
  (list numbering + yellow highlights preserved; form-field placeholder kept)
- Cash access services left factual (ties to risk provisions)
- Additional services labels tightened
- Client responsibilities reframed as shared-control partnership
- Service satisfaction lightly warmed; fees/retainer reviewed, left as-is

Co-Authored-By: Claude Opus 4.8 <noreply@anthropic.com>
Claude-Session: https://claude.ai/code/session_01DN4EejCmNTZeYY4X9coMuA
</commit_message>
<xml_diff>
--- a/Onyx_Engagement_Letter_REVISED.docx
+++ b/Onyx_Engagement_Letter_REVISED.docx
@@ -900,16 +900,7 @@
         <w:jc w:val="both"/>
       </w:pPr>
       <w:r>
-        <w:t>ONYX</w:t>
-      </w:r>
-      <w:r>
-        <w:t xml:space="preserve"> will perform the following services for the </w:t>
-      </w:r>
-      <w:r>
-        <w:t>Client</w:t>
-      </w:r>
-      <w:r>
-        <w:t>:</w:t>
+        <w:t xml:space="preserve">ONYX becomes the Client’s accounting department — without the cost, turnover, and overhead of building one in-house. Our team runs the day-to-day transaction work and layers on controller-level oversight, keeping the Client’s books accurate, current, and ready to drive decisions — so the Client’s leaders can spend their time running the business instead of chasing the numbers. Specifically, ONYX will perform the following services:</w:t>
       </w:r>
     </w:p>
     <w:p>
@@ -939,7 +930,7 @@
         <w:rPr>
           <w:highlight w:val="yellow"/>
         </w:rPr>
-        <w:t>Outsourced accounting functions - staff</w:t>
+        <w:t xml:space="preserve">Day-to-day accounting operations</w:t>
       </w:r>
     </w:p>
     <w:p>
@@ -955,27 +946,7 @@
         <w:rPr>
           <w:highlight w:val="yellow"/>
         </w:rPr>
-        <w:t xml:space="preserve">Process accounts payable </w:t>
-      </w:r>
-      <w:proofErr w:type="gramStart"/>
-      <w:r>
-        <w:rPr>
-          <w:highlight w:val="yellow"/>
-        </w:rPr>
-        <w:t>including</w:t>
-      </w:r>
-      <w:proofErr w:type="gramEnd"/>
-      <w:r>
-        <w:rPr>
-          <w:highlight w:val="yellow"/>
-        </w:rPr>
-        <w:t xml:space="preserve"> the preparation and issuance of chec</w:t>
-      </w:r>
-      <w:r>
-        <w:rPr>
-          <w:highlight w:val="yellow"/>
-        </w:rPr>
-        <w:t>ks</w:t>
+        <w:t xml:space="preserve">Own the full accounts payable cycle — from vendor invoices through preparing and issuing checks — so bills are paid accurately and on time</w:t>
       </w:r>
     </w:p>
     <w:p>
@@ -991,7 +962,7 @@
         <w:rPr>
           <w:highlight w:val="yellow"/>
         </w:rPr>
-        <w:t>Prepare billings, record billings, enter cash receipts, and track sales tax</w:t>
+        <w:t xml:space="preserve">Prepare and record customer billings, apply cash receipts, and keep sales tax tracked and current</w:t>
       </w:r>
     </w:p>
     <w:p>
@@ -1007,7 +978,7 @@
         <w:rPr>
           <w:highlight w:val="yellow"/>
         </w:rPr>
-        <w:t>Coordinate payroll for U.S. entities</w:t>
+        <w:t xml:space="preserve">Coordinate payroll for U.S. entities so the team is paid accurately and on schedule</w:t>
       </w:r>
     </w:p>
     <w:p>
@@ -1023,13 +994,7 @@
         <w:rPr>
           <w:highlight w:val="yellow"/>
         </w:rPr>
-        <w:t>Reconcile certain accounts monthly and prepare journal entr</w:t>
-      </w:r>
-      <w:r>
-        <w:rPr>
-          <w:highlight w:val="yellow"/>
-        </w:rPr>
-        <w:t>ies</w:t>
+        <w:t xml:space="preserve">Reconcile accounts and post journal entries every month, keeping the books clean and close-ready</w:t>
       </w:r>
     </w:p>
     <w:p>
@@ -1045,7 +1010,7 @@
         <w:rPr>
           <w:highlight w:val="yellow"/>
         </w:rPr>
-        <w:t>Prepare depreciation schedules</w:t>
+        <w:t xml:space="preserve">Maintain depreciation schedules</w:t>
       </w:r>
     </w:p>
     <w:p>
@@ -1122,7 +1087,7 @@
         <w:rPr>
           <w:highlight w:val="yellow"/>
         </w:rPr>
-        <w:t>Outsourced accounting functions - controller</w:t>
+        <w:t xml:space="preserve">Controller-level oversight and reporting</w:t>
       </w:r>
     </w:p>
     <w:p>
@@ -1138,7 +1103,7 @@
         <w:rPr>
           <w:highlight w:val="yellow"/>
         </w:rPr>
-        <w:t>Review and approve monthly reconciliations and journal entries prepared by staff</w:t>
+        <w:t xml:space="preserve">Review and approve the reconciliations and journal entries our staff prepare, adding a second layer of accuracy and control</w:t>
       </w:r>
     </w:p>
     <w:p>
@@ -1154,7 +1119,7 @@
         <w:rPr>
           <w:highlight w:val="yellow"/>
         </w:rPr>
-        <w:t>Reconcile complex accounts monthly and prepare journal entries</w:t>
+        <w:t xml:space="preserve">Reconcile complex accounts and prepare the related journal entries</w:t>
       </w:r>
     </w:p>
     <w:p>
@@ -1170,19 +1135,7 @@
         <w:rPr>
           <w:highlight w:val="yellow"/>
         </w:rPr>
-        <w:t>Analyze financial statements an</w:t>
-      </w:r>
-      <w:r>
-        <w:rPr>
-          <w:highlight w:val="yellow"/>
-        </w:rPr>
-        <w:t>d present to man</w:t>
-      </w:r>
-      <w:r>
-        <w:rPr>
-          <w:highlight w:val="yellow"/>
-        </w:rPr>
-        <w:t>agement</w:t>
+        <w:t xml:space="preserve">Turn the Client’s financial results into clear, actionable analysis and present it to management</w:t>
       </w:r>
     </w:p>
     <w:p>
@@ -1198,25 +1151,7 @@
         <w:rPr>
           <w:highlight w:val="yellow"/>
         </w:rPr>
-        <w:t>Develop and track key business metrics as requested and review pe</w:t>
-      </w:r>
-      <w:r>
-        <w:rPr>
-          <w:highlight w:val="yellow"/>
-        </w:rPr>
-        <w:t xml:space="preserve">riodically </w:t>
-      </w:r>
-      <w:r>
-        <w:rPr>
-          <w:highlight w:val="yellow"/>
-        </w:rPr>
-        <w:t xml:space="preserve">with </w:t>
-      </w:r>
-      <w:r>
-        <w:rPr>
-          <w:highlight w:val="yellow"/>
-        </w:rPr>
-        <w:t>management</w:t>
+        <w:t xml:space="preserve">Develop and track the key business metrics that matter most to the Client, and review them with management on a regular basis</w:t>
       </w:r>
     </w:p>
     <w:p>
@@ -1232,7 +1167,7 @@
         <w:rPr>
           <w:highlight w:val="yellow"/>
         </w:rPr>
-        <w:t>Provide budgeting services</w:t>
+        <w:t xml:space="preserve">Build and support budgets that give the Client both a roadmap and a benchmark</w:t>
       </w:r>
     </w:p>
     <w:p>
@@ -1248,8 +1183,7 @@
         <w:rPr>
           <w:highlight w:val="yellow"/>
         </w:rPr>
-        <w:lastRenderedPageBreak/>
-        <w:t>Document accounting processes and procedures</w:t>
+        <w:t xml:space="preserve">Document the Client’s accounting processes and procedures</w:t>
       </w:r>
     </w:p>
     <w:p>
@@ -1261,19 +1195,11 @@
         </w:numPr>
         <w:jc w:val="both"/>
       </w:pPr>
-      <w:proofErr w:type="gramStart"/>
-      <w:r>
-        <w:rPr>
-          <w:highlight w:val="yellow"/>
-        </w:rPr>
-        <w:t>Continue</w:t>
-      </w:r>
-      <w:proofErr w:type="gramEnd"/>
-      <w:r>
-        <w:rPr>
-          <w:highlight w:val="yellow"/>
-        </w:rPr>
-        <w:t xml:space="preserve"> process and procedure improvement implementation</w:t>
+      <w:r>
+        <w:rPr>
+          <w:highlight w:val="yellow"/>
+        </w:rPr>
+        <w:t xml:space="preserve">Continuously refine and strengthen those processes as the business grows</w:t>
       </w:r>
     </w:p>
     <w:p>
@@ -1289,7 +1215,7 @@
         <w:rPr>
           <w:highlight w:val="yellow"/>
         </w:rPr>
-        <w:t>Report and manage cash flows</w:t>
+        <w:t xml:space="preserve">Monitor and manage cash flow so the Client always knows what’s coming in and going out</w:t>
       </w:r>
     </w:p>
     <w:p>
@@ -1305,7 +1231,7 @@
         <w:rPr>
           <w:highlight w:val="yellow"/>
         </w:rPr>
-        <w:t>Assist with bank communications and negotiations</w:t>
+        <w:t xml:space="preserve">Stand alongside the Client in bank communications and negotiations</w:t>
       </w:r>
     </w:p>
     <w:p>
@@ -1321,28 +1247,7 @@
         <w:rPr>
           <w:highlight w:val="yellow"/>
         </w:rPr>
-        <w:t xml:space="preserve">Gather information necessary to prepare the </w:t>
-      </w:r>
-      <w:r>
-        <w:rPr>
-          <w:highlight w:val="yellow"/>
-        </w:rPr>
-        <w:t>Client</w:t>
-      </w:r>
-      <w:r>
-        <w:rPr>
-          <w:highlight w:val="yellow"/>
-        </w:rPr>
-        <w:t xml:space="preserve">’s </w:t>
-      </w:r>
-      <w:r>
-        <w:rPr>
-          <w:highlight w:val="yellow"/>
-        </w:rPr>
-        <w:t>annual tax return</w:t>
-      </w:r>
-      <w:r>
-        <w:t xml:space="preserve"> </w:t>
+        <w:t xml:space="preserve">Gather and organize everything the Client’s tax preparer needs for the annual return</w:t>
       </w:r>
     </w:p>
     <w:p>
@@ -1666,7 +1571,7 @@
         <w:jc w:val="both"/>
       </w:pPr>
       <w:r>
-        <w:t>Additional services are presented in the attached addendum(s).</w:t>
+        <w:t xml:space="preserve">The following additional services are available and, when engaged, are described in the attached addendum(s):</w:t>
       </w:r>
     </w:p>
     <w:p>
@@ -1682,7 +1587,7 @@
         <w:rPr>
           <w:highlight w:val="yellow"/>
         </w:rPr>
-        <w:t>Payroll preparation services</w:t>
+        <w:t xml:space="preserve">Payroll preparation</w:t>
       </w:r>
     </w:p>
     <w:p>
@@ -1698,13 +1603,7 @@
         <w:rPr>
           <w:highlight w:val="yellow"/>
         </w:rPr>
-        <w:t>Intacct</w:t>
-      </w:r>
-      <w:r>
-        <w:rPr>
-          <w:highlight w:val="yellow"/>
-        </w:rPr>
-        <w:t xml:space="preserve"> services</w:t>
+        <w:t xml:space="preserve">Sage Intacct implementation and support</w:t>
       </w:r>
     </w:p>
     <w:p>
@@ -1720,13 +1619,7 @@
         <w:rPr>
           <w:highlight w:val="yellow"/>
         </w:rPr>
-        <w:t xml:space="preserve">Hosting </w:t>
-      </w:r>
-      <w:r>
-        <w:rPr>
-          <w:highlight w:val="yellow"/>
-        </w:rPr>
-        <w:t>services</w:t>
+        <w:t xml:space="preserve">Hosting</w:t>
       </w:r>
     </w:p>
     <w:p>
@@ -1742,7 +1635,7 @@
         <w:rPr>
           <w:highlight w:val="yellow"/>
         </w:rPr>
-        <w:t>Human resource services</w:t>
+        <w:t xml:space="preserve">Human resources</w:t>
       </w:r>
     </w:p>
     <w:p>
@@ -1755,7 +1648,7 @@
         <w:jc w:val="both"/>
       </w:pPr>
       <w:r>
-        <w:t>Work opportunity tax credit services</w:t>
+        <w:t xml:space="preserve">Work Opportunity Tax Credit (WOTC) services</w:t>
       </w:r>
     </w:p>
     <w:p>
@@ -2194,13 +2087,7 @@
         <w:rPr>
           <w:highlight w:val="yellow"/>
         </w:rPr>
-        <w:t>The Client</w:t>
-      </w:r>
-      <w:r>
-        <w:rPr>
-          <w:highlight w:val="yellow"/>
-        </w:rPr>
-        <w:t xml:space="preserve"> is responsible for the processes below. All approvals listed must be documented in writing, either electronically or manually:</w:t>
+        <w:t xml:space="preserve">Strong financial controls depend on a clear separation of duties. Because ONYX executes transactions on the Client’s behalf, the Client keeps approval authority over the items below — a safeguard that protects the Client’s assets and keeps key decisions in the Client’s hands. The Client is responsible for the following, and all approvals must be documented in writing, whether electronically or manually:</w:t>
       </w:r>
     </w:p>
     <w:p>
@@ -2294,7 +2181,7 @@
         <w:rPr>
           <w:highlight w:val="yellow"/>
         </w:rPr>
-        <w:t>Approve all new employees and all employee status changes prior to those employees or changes being added to the payroll system.</w:t>
+        <w:t xml:space="preserve">Approve all new employees and employee status changes before they are entered into the payroll system.</w:t>
       </w:r>
     </w:p>
     <w:p>
@@ -2313,8 +2200,7 @@
         <w:rPr>
           <w:highlight w:val="yellow"/>
         </w:rPr>
-        <w:lastRenderedPageBreak/>
-        <w:t>Approve all credit card statements prior to those expenses being processed in the accounting system and subsequently paid.</w:t>
+        <w:t xml:space="preserve">Approve all credit card statements before those expenses are processed and paid.</w:t>
       </w:r>
     </w:p>
     <w:p>
@@ -4712,24 +4598,7 @@
         <w:jc w:val="both"/>
       </w:pPr>
       <w:r>
-        <w:rPr>
-          <w:highlight w:val="yellow"/>
-        </w:rPr>
-        <w:t xml:space="preserve">Upon full payment of our invoice, we will assume you are satisfied with our </w:t>
-      </w:r>
-      <w:proofErr w:type="gramStart"/>
-      <w:r>
-        <w:rPr>
-          <w:highlight w:val="yellow"/>
-        </w:rPr>
-        <w:t>work</w:t>
-      </w:r>
-      <w:proofErr w:type="gramEnd"/>
-      <w:r>
-        <w:rPr>
-          <w:highlight w:val="yellow"/>
-        </w:rPr>
-        <w:t xml:space="preserve"> and our service commitment will have been fulfilled.</w:t>
+        <w:t xml:space="preserve">We stand behind our work. Upon full payment of our invoice, we will consider you satisfied with our services and our service commitment fulfilled.</w:t>
       </w:r>
     </w:p>
     <w:p>

</xml_diff>

<commit_message>
Restore punchy Scope intro; light clarity pass on fee section
- Revert Scope intro to the sales-forward version
- Tighten the two fee-explainer paragraphs (meaning/numbers preserved)
- Fix 'rendered  bi-weekly' double space
- Note fee-section structural items for client to resolve (hourly vs fixed,
  'not guaranteed' wording in fixed block, [hours] placeholders)

Co-Authored-By: Claude Opus 4.8 <noreply@anthropic.com>
Claude-Session: https://claude.ai/code/session_01DN4EejCmNTZeYY4X9coMuA
</commit_message>
<xml_diff>
--- a/Onyx_Engagement_Letter_REVISED.docx
+++ b/Onyx_Engagement_Letter_REVISED.docx
@@ -900,7 +900,7 @@
         <w:jc w:val="both"/>
       </w:pPr>
       <w:r>
-        <w:t xml:space="preserve">ONYX serves as the Client’s outsourced accounting function, handling the day-to-day transaction work and providing controller-level oversight to keep the Client’s books accurate, current, and useful for management decisions. ONYX will perform the following services for the Client:</w:t>
+        <w:t xml:space="preserve">ONYX becomes the Client’s accounting department — without the cost, turnover, and overhead of building one in-house. Our team runs the day-to-day transaction work and layers on controller-level oversight, keeping the Client’s books accurate, current, and ready to drive decisions — so the Client’s leaders can spend their time running the business instead of chasing the numbers. Specifically, ONYX will perform the following services:</w:t>
       </w:r>
     </w:p>
     <w:p>
@@ -3164,76 +3164,7 @@
         <w:rPr>
           <w:highlight w:val="yellow"/>
         </w:rPr>
-        <w:t xml:space="preserve">Our fees for these services will be based on the time involved and the degree of responsibility and skills required, plus </w:t>
-      </w:r>
-      <w:r>
-        <w:rPr>
-          <w:highlight w:val="yellow"/>
-        </w:rPr>
-        <w:t xml:space="preserve">expenses including </w:t>
-      </w:r>
-      <w:r>
-        <w:rPr>
-          <w:highlight w:val="yellow"/>
-        </w:rPr>
-        <w:t xml:space="preserve">internal and administrative charges. The time estimate is based on anticipated cooperation from </w:t>
-      </w:r>
-      <w:r>
-        <w:rPr>
-          <w:highlight w:val="yellow"/>
-        </w:rPr>
-        <w:t>the Client’s</w:t>
-      </w:r>
-      <w:r>
-        <w:rPr>
-          <w:highlight w:val="yellow"/>
-        </w:rPr>
-        <w:t xml:space="preserve"> </w:t>
-      </w:r>
-      <w:r>
-        <w:rPr>
-          <w:highlight w:val="yellow"/>
-        </w:rPr>
-        <w:t xml:space="preserve">personnel and their assistance with preparing requested schedules. If the requested items are not available on the dates required or are not accurate, the estimated fee for services will likely be higher. If unexpected circumstances require significant additional time, </w:t>
-      </w:r>
-      <w:r>
-        <w:rPr>
-          <w:highlight w:val="yellow"/>
-        </w:rPr>
-        <w:t>ONYX</w:t>
-      </w:r>
-      <w:r>
-        <w:rPr>
-          <w:highlight w:val="yellow"/>
-        </w:rPr>
-        <w:t xml:space="preserve"> </w:t>
-      </w:r>
-      <w:r>
-        <w:rPr>
-          <w:highlight w:val="yellow"/>
-        </w:rPr>
-        <w:t xml:space="preserve">will advise </w:t>
-      </w:r>
-      <w:r>
-        <w:rPr>
-          <w:highlight w:val="yellow"/>
-        </w:rPr>
-        <w:t>the Client</w:t>
-      </w:r>
-      <w:r>
-        <w:rPr>
-          <w:highlight w:val="yellow"/>
-        </w:rPr>
-        <w:t xml:space="preserve"> </w:t>
-      </w:r>
-      <w:r>
-        <w:rPr>
-          <w:highlight w:val="yellow"/>
-        </w:rPr>
-        <w:t>before undertaking work that would require a substantial increase in the fee estimate.</w:t>
-      </w:r>
-      <w:r>
-        <w:t xml:space="preserve"> </w:t>
+        <w:t xml:space="preserve">Our fees for these services will be based on the time involved and the degree of responsibility and skill required, plus expenses, including internal and administrative charges. These estimates assume timely cooperation and assistance from the Client’s personnel in preparing requested schedules; if requested items are not available when needed or are inaccurate, the fee will likely be higher. Should unexpected circumstances require significant additional time, ONYX will advise the Client before undertaking any work that would substantially increase the fee estimate.</w:t>
       </w:r>
     </w:p>
     <w:p>
@@ -3483,129 +3414,20 @@
         <w:rPr>
           <w:highlight w:val="yellow"/>
         </w:rPr>
-        <w:t xml:space="preserve">The </w:t>
-      </w:r>
-      <w:r>
-        <w:rPr>
-          <w:highlight w:val="yellow"/>
-        </w:rPr>
-        <w:t>fee</w:t>
-      </w:r>
-      <w:r>
-        <w:rPr>
-          <w:highlight w:val="yellow"/>
-        </w:rPr>
-        <w:t xml:space="preserve"> estimate is based on anticipated cooperation from </w:t>
-      </w:r>
-      <w:r>
-        <w:rPr>
-          <w:highlight w:val="yellow"/>
-        </w:rPr>
-        <w:t>the Client’s</w:t>
-      </w:r>
+        <w:t xml:space="preserve">This fee estimate assumes timely cooperation and assistance from the Client’s personnel in preparing requested schedules. Unless we state otherwise in writing, the estimate is not a maximum, minimum, fixed, or guaranteed amount, and the actual cost of our services may be more or less than the estimate. Its accuracy may vary due to facts or circumstances beyond our control — for example, if requested items are not available when needed or are inaccurate. Should unexpected circumstances require significant additional time, ONYX will advise the Client before undertaking any work that would substantially increase the fee estimate.</w:t>
+      </w:r>
+    </w:p>
+    <w:p>
+      <w:pPr>
+        <w:pStyle w:val="CLALTRNormal"/>
+        <w:jc w:val="both"/>
+      </w:pPr>
       <w:r>
         <w:rPr>
           <w:highlight w:val="yellow"/>
         </w:rPr>
         <w:t xml:space="preserve"> </w:t>
       </w:r>
-      <w:r>
-        <w:rPr>
-          <w:highlight w:val="yellow"/>
-        </w:rPr>
-        <w:t>personnel and their assistance with preparing requested schedules</w:t>
-      </w:r>
-      <w:r>
-        <w:rPr>
-          <w:highlight w:val="yellow"/>
-        </w:rPr>
-        <w:t xml:space="preserve">. </w:t>
-      </w:r>
-      <w:r>
-        <w:rPr>
-          <w:highlight w:val="yellow"/>
-          <w:u w:val="single"/>
-        </w:rPr>
-        <w:t>The fee estimate is not maximum or minimum or fixed or guaranteed unless we say otherwise in writing</w:t>
-      </w:r>
-      <w:r>
-        <w:rPr>
-          <w:highlight w:val="yellow"/>
-        </w:rPr>
-        <w:t>.</w:t>
-      </w:r>
-      <w:r>
-        <w:rPr>
-          <w:highlight w:val="yellow"/>
-        </w:rPr>
-        <w:t xml:space="preserve"> The actual cost of our services may be more or less than the fee estimate.</w:t>
-      </w:r>
-      <w:r>
-        <w:rPr>
-          <w:highlight w:val="yellow"/>
-        </w:rPr>
-        <w:t xml:space="preserve"> </w:t>
-      </w:r>
-      <w:r>
-        <w:rPr>
-          <w:highlight w:val="yellow"/>
-        </w:rPr>
-        <w:t>The accuracy of our estimate may vary depending on facts or circumstances beyond our control, such as if</w:t>
-      </w:r>
-      <w:r>
-        <w:rPr>
-          <w:highlight w:val="yellow"/>
-        </w:rPr>
-        <w:t xml:space="preserve"> the requested items are not available on the dates required or are not accurate. If unexpected circumstances require significant additional time, </w:t>
-      </w:r>
-      <w:r>
-        <w:rPr>
-          <w:highlight w:val="yellow"/>
-        </w:rPr>
-        <w:t>ONYX</w:t>
-      </w:r>
-      <w:r>
-        <w:rPr>
-          <w:highlight w:val="yellow"/>
-        </w:rPr>
-        <w:t xml:space="preserve"> </w:t>
-      </w:r>
-      <w:r>
-        <w:rPr>
-          <w:highlight w:val="yellow"/>
-        </w:rPr>
-        <w:t xml:space="preserve">will advise </w:t>
-      </w:r>
-      <w:r>
-        <w:rPr>
-          <w:highlight w:val="yellow"/>
-        </w:rPr>
-        <w:t>the Client</w:t>
-      </w:r>
-      <w:r>
-        <w:rPr>
-          <w:highlight w:val="yellow"/>
-        </w:rPr>
-        <w:t xml:space="preserve"> </w:t>
-      </w:r>
-      <w:r>
-        <w:rPr>
-          <w:highlight w:val="yellow"/>
-        </w:rPr>
-        <w:t>before undertaking work that would require a substantial increase in the fee estimate.</w:t>
-      </w:r>
-    </w:p>
-    <w:p>
-      <w:pPr>
-        <w:pStyle w:val="CLALTRNormal"/>
-        <w:jc w:val="both"/>
-      </w:pPr>
-      <w:r>
-        <w:rPr>
-          <w:highlight w:val="yellow"/>
-        </w:rPr>
-        <w:t xml:space="preserve"> </w:t>
-      </w:r>
       <w:proofErr w:type="gramStart"/>
       <w:r>
         <w:rPr>
@@ -3702,9 +3524,6 @@
       <w:proofErr w:type="gramStart"/>
       <w:r>
         <w:t xml:space="preserve">rendered </w:t>
-      </w:r>
-      <w:r>
-        <w:t xml:space="preserve"> </w:t>
       </w:r>
       <w:r>
         <w:rPr>

</xml_diff>